<commit_message>
Bakery on Cutter Street: full read-through fixes; rebuild EPUB and DOCX
- Continuity fixes across chapters (Biscuit's arrival, market timing,
  Mabel timeline, Hannah's time home, 1989 loan, trustee appointment,
  Pike sign and crew, mother's letters, rolling pin dates).
- Converted to US spelling and idiom throughout.
- Removed remaining profanity so the metadata claim holds.
- Rebuilt manuscript, EPUB (EPUBCheck 0 errors, 0 warnings) and DOCX.
- Updated metadata word count and review notes.

Co-Authored-By: Claude Haiku 5.5 <noreply@anthropic.com>
Claude-Session: https://claude.ai/code/session_01MZeVJcyf7XvKRRCE6AUkLk
</commit_message>
<xml_diff>
--- a/Ready to publish/the-bakery-on-cutter-street-book-1/the-bakery-on-cutter-street.docx
+++ b/Ready to publish/the-bakery-on-cutter-street-book-1/the-bakery-on-cutter-street.docx
@@ -2,110 +2,6 @@
 <file path=word/document.xml><?xml version="1.0" encoding="utf-8"?>
 <w:document xmlns:w="http://schemas.openxmlformats.org/wordprocessingml/2006/main" xmlns:m="http://schemas.openxmlformats.org/officeDocument/2006/math" xmlns:r="http://schemas.openxmlformats.org/officeDocument/2006/relationships" xmlns:o="urn:schemas-microsoft-com:office:office" xmlns:v="urn:schemas-microsoft-com:vml" xmlns:w10="urn:schemas-microsoft-com:office:word" xmlns:a="http://schemas.openxmlformats.org/drawingml/2006/main" xmlns:pic="http://schemas.openxmlformats.org/drawingml/2006/picture" xmlns:wp="http://schemas.openxmlformats.org/drawingml/2006/wordprocessingDrawing">
   <w:body>
-    <w:p>
-      <w:pPr>
-        <w:pStyle w:val="Title"/>
-      </w:pPr>
-      <w:r>
-        <w:t xml:space="preserve">The</w:t>
-      </w:r>
-      <w:r>
-        <w:t xml:space="preserve"> </w:t>
-      </w:r>
-      <w:r>
-        <w:t xml:space="preserve">Bakery</w:t>
-      </w:r>
-      <w:r>
-        <w:t xml:space="preserve"> </w:t>
-      </w:r>
-      <w:r>
-        <w:t xml:space="preserve">on</w:t>
-      </w:r>
-      <w:r>
-        <w:t xml:space="preserve"> </w:t>
-      </w:r>
-      <w:r>
-        <w:t xml:space="preserve">Cutter</w:t>
-      </w:r>
-      <w:r>
-        <w:t xml:space="preserve"> </w:t>
-      </w:r>
-      <w:r>
-        <w:t xml:space="preserve">Street</w:t>
-      </w:r>
-    </w:p>
-    <w:p>
-      <w:pPr>
-        <w:pStyle w:val="Subtitle"/>
-      </w:pPr>
-      <w:r>
-        <w:t xml:space="preserve">A</w:t>
-      </w:r>
-      <w:r>
-        <w:t xml:space="preserve"> </w:t>
-      </w:r>
-      <w:r>
-        <w:t xml:space="preserve">Cutter</w:t>
-      </w:r>
-      <w:r>
-        <w:t xml:space="preserve"> </w:t>
-      </w:r>
-      <w:r>
-        <w:t xml:space="preserve">Street</w:t>
-      </w:r>
-      <w:r>
-        <w:t xml:space="preserve"> </w:t>
-      </w:r>
-      <w:r>
-        <w:t xml:space="preserve">Novel,</w:t>
-      </w:r>
-      <w:r>
-        <w:t xml:space="preserve"> </w:t>
-      </w:r>
-      <w:r>
-        <w:t xml:space="preserve">Book</w:t>
-      </w:r>
-      <w:r>
-        <w:t xml:space="preserve"> </w:t>
-      </w:r>
-      <w:r>
-        <w:t xml:space="preserve">1</w:t>
-      </w:r>
-    </w:p>
-    <w:p>
-      <w:pPr>
-        <w:pStyle w:val="Author"/>
-      </w:pPr>
-      <w:r>
-        <w:t xml:space="preserve">Skybee</w:t>
-      </w:r>
-    </w:p>
-    <w:sdt>
-      <w:sdtPr>
-        <w:docPartObj>
-          <w:docPartGallery w:val="Table of Contents"/>
-          <w:docPartUnique/>
-        </w:docPartObj>
-      </w:sdtPr>
-      <w:sdtContent>
-        <w:p>
-          <w:pPr>
-            <w:pStyle w:val="TOCHeading"/>
-          </w:pPr>
-          <w:r>
-            <w:t xml:space="preserve">Table of Contents</w:t>
-          </w:r>
-        </w:p>
-        <w:p>
-          <w:r>
-            <w:fldChar w:fldCharType="begin" w:dirty="true"/>
-            <w:instrText xml:space="preserve">TOC \o "1-3" \h \z \u</w:instrText>
-            <w:fldChar w:fldCharType="separate"/>
-            <w:fldChar w:fldCharType="end"/>
-          </w:r>
-        </w:p>
-      </w:sdtContent>
-    </w:sdt>
     <w:p>
       <w:pPr>
         <w:pStyle w:val="FirstParagraph"/>
@@ -3613,7 +3509,7 @@
         <w:pStyle w:val="BodyText"/>
       </w:pPr>
       <w:r>
-        <w:t xml:space="preserve">She set out on the Monday after the oven was fixed, with a paper cup of coffee in one hand and Biscuit’s lead looped twice round her wrist. The dog had views on the matter. He wanted to sniff every lamppost, every doorstep, every bin lid on the block, and he made his feelings known with long, dramatic pauses and a snort of protest whenever she tried to move him along.</w:t>
+        <w:t xml:space="preserve">She set out on the Monday after the oven was fixed, with a paper cup of coffee in one hand and a leash looped twice around her wrist, its other end clipped to Biscuit, Tom Kowalski’s dog, whom Tom had asked her to walk while he drove a load of feed out to the farms. The dog had views on the matter. He wanted to sniff every lamppost, every doorstep, every trash can lid on the block, and he made his feelings known with long, dramatic pauses and a snort of protest whenever she tried to move him along.</w:t>
       </w:r>
     </w:p>
     <w:p>
@@ -3653,7 +3549,7 @@
         <w:pStyle w:val="BodyText"/>
       </w:pPr>
       <w:r>
-        <w:t xml:space="preserve">Biscuit sat down on the pavement in front of the hardware store and looked at her with the patience of a dog who had heard this sort of speech before and had outlived all of them.</w:t>
+        <w:t xml:space="preserve">Biscuit sat down on the sidewalk in front of the hardware store and looked at her with the patience of a dog who had heard this sort of speech before and had outlived all of them.</w:t>
       </w:r>
     </w:p>
     <w:p>
@@ -3878,7 +3774,7 @@
         <w:pStyle w:val="BodyText"/>
       </w:pPr>
       <w:r>
-        <w:t xml:space="preserve">The diner was already busy, its windows steamed to a soft white glow, the smell of frying bacon and coffee pouring out onto the pavement. Mrs. Ortiz was behind the counter with a pencil in her hair and a tray of eggs in one hand, shouting orders at the cook in a mix of Spanish and English that made the regulars grin into their plates.</w:t>
+        <w:t xml:space="preserve">The diner was already busy, its windows steamed to a soft white glow, the smell of frying bacon and coffee pouring out onto the sidewalk. Mrs. Ortiz was behind the counter with a pencil in her hair and a tray of eggs in one hand, shouting orders at the cook in a mix of Spanish and English that made the regulars grin into their plates.</w:t>
       </w:r>
     </w:p>
     <w:p>
@@ -4178,7 +4074,7 @@
         <w:pStyle w:val="BodyText"/>
       </w:pPr>
       <w:r>
-        <w:t xml:space="preserve">Hannah walked on after breakfast, up past the post office and the chemist, and at the top of the hill she stopped by the wrought-iron gate of the old Methodist chapel, which had been closed since before she was born. The gate was rusted, the paint peeling, but someone had planted a row of small white crocuses along the path, and they were coming up through the last of the snow, bright and stubborn.</w:t>
+        <w:t xml:space="preserve">Hannah walked on after breakfast, up past the post office and the pharmacy, and at the top of the hill she stopped by the wrought-iron gate of the old Methodist chapel, which had been closed since before she was born. The gate was rusted, the paint peeling, but someone had planted a row of small white crocuses along the path, and they were coming up through the last of the snow, bright and stubborn.</w:t>
       </w:r>
     </w:p>
     <w:p>
@@ -4276,7 +4172,7 @@
         <w:pStyle w:val="BodyText"/>
       </w:pPr>
       <w:r>
-        <w:t xml:space="preserve">She looked up. A woman in a green wool coat was standing by the chapel steps with a watering can, her grey hair cut very short and her face weathered by years outside. She looked to be about seventy, and she had a smile that seemed to have been used sparingly and was all the more valuable for it.</w:t>
+        <w:t xml:space="preserve">She looked up. A woman in a green wool coat was standing by the chapel steps with a watering can, her gray hair cut very short and her face weathered by years outside. She looked to be about seventy, and she had a smile that seemed to have been used sparingly and was all the more valuable for it.</w:t>
       </w:r>
     </w:p>
     <w:p>
@@ -4609,7 +4505,7 @@
         <w:pStyle w:val="BodyText"/>
       </w:pPr>
       <w:r>
-        <w:t xml:space="preserve">Her grandmother had walked this street every morning for sixty years. She had known every name, every shop, every bench. She had kept a ledger of debts and favours and promises. And she had left behind, for the granddaughter who had run away at eighteen, a street full of people who were waiting for her to come back.</w:t>
+        <w:t xml:space="preserve">Her grandmother had walked this street every morning for sixty years. She had known every name, every shop, every bench. She had kept a ledger of debts and favors and promises. And she had left behind, for the granddaughter who had run away at eighteen, a street full of people who were waiting for her to come back.</w:t>
       </w:r>
     </w:p>
     <w:p>
@@ -6330,7 +6226,7 @@
         <w:pStyle w:val="BodyText"/>
       </w:pPr>
       <w:r>
-        <w:t xml:space="preserve">Hannah pressed her palms flat against the counter. The cold of the stone seeped up into her wrists. Outside, the street was grey and damp, and a plow truck rumbled slowly past with its orange light turning over and over, painting the snowbanks in bright, sharp bands.</w:t>
+        <w:t xml:space="preserve">Hannah pressed her palms flat against the counter. The cold of the stone seeped up into her wrists. Outside, the street was gray and damp, and a plow truck rumbled slowly past with its orange light turning over and over, painting the snowbanks in bright, sharp bands.</w:t>
       </w:r>
     </w:p>
     <w:p>
@@ -6874,7 +6770,7 @@
         <w:pStyle w:val="BodyText"/>
       </w:pPr>
       <w:r>
-        <w:t xml:space="preserve">Hannah found out at six in the morning, when she lifted the cloth from the crock and smelled nothing but flat, grey, lifeless flour. The surface was dry and cracked like old paint. The bubbles that had risen so faithfully every morning for a week had vanished, leaving behind a crust that looked more like cement than a living thing.</w:t>
+        <w:t xml:space="preserve">Hannah found out at six in the morning, when she lifted the cloth from the crock and smelled nothing but flat, gray, lifeless flour. The surface was dry and cracked like old paint. The bubbles that had risen so faithfully every morning for a week had vanished, leaving behind a crust that looked more like cement than a living thing.</w:t>
       </w:r>
     </w:p>
     <w:p>
@@ -7226,7 +7122,7 @@
         <w:pStyle w:val="BodyText"/>
       </w:pPr>
       <w:r>
-        <w:t xml:space="preserve">Hannah looked at the crock, at the crust and the grey, and felt something hard and bitter rise in her throat.</w:t>
+        <w:t xml:space="preserve">Hannah looked at the crock, at the crust and the gray, and felt something hard and bitter rise in her throat.</w:t>
       </w:r>
       <w:r>
         <w:t xml:space="preserve"> </w:t>
@@ -7929,7 +7825,7 @@
         <w:pStyle w:val="BodyText"/>
       </w:pPr>
       <w:r>
-        <w:t xml:space="preserve">Eli arrived at half past seven, with his hair still wet from the shower and a paper bag of pastries from the diner under one arm. He stopped in the doorway of the kitchen, took in the cake, the candle, and the jar of bubbling starter sitting in the middle of the table like a guest of honour, and burst out laughing.</w:t>
+        <w:t xml:space="preserve">Eli arrived at half past seven, with his hair still wet from the shower and a paper bag of pastries from the diner under one arm. He stopped in the doorway of the kitchen, took in the cake, the candle, and the jar of bubbling starter sitting in the middle of the table like a guest of honors, and burst out laughing.</w:t>
       </w:r>
     </w:p>
     <w:p>
@@ -8111,7 +8007,7 @@
         <w:pStyle w:val="BodyText"/>
       </w:pPr>
       <w:r>
-        <w:t xml:space="preserve">They ate on the back step, in the thin autumn sunshine, with the cake on a tray between them and the dog lying across their feet like an overfed draught excluder. Walt came down from the library and sat on the edge of the step with a slice in one hand and his cap in the other, and told them, very solemnly, that in his opinion the starter was the finest thing to have happened to Cutter Street since the mill closed.</w:t>
+        <w:t xml:space="preserve">They ate on the back step, in the thin autumn sunshine, with the cake on a tray between them and the dog lying across their feet like an overfed draft excluder. Walt came down from the library and sat on the edge of the step with a slice in one hand and his cap in the other, and told them, very solemnly, that in his opinion the starter was the finest thing to have happened to Cutter Street since the mill closed.</w:t>
       </w:r>
     </w:p>
     <w:p>
@@ -8243,7 +8139,7 @@
         <w:pStyle w:val="BodyText"/>
       </w:pPr>
       <w:r>
-        <w:t xml:space="preserve">Tom Kowalski came up the lane with a tin of flapjacks, a fresh bandana tied round his head, and an expression of enormous, nervous pride. He had brought, as he put it, a small contribution for the guest of honour. The contribution was a tiny wooden spoon, carved by hand, with the name</w:t>
+        <w:t xml:space="preserve">Tom Kowalski came up the lane with a tin of flapjacks, a fresh bandana tied around his head, and an expression of enormous, nervous pride. He had brought, as he put it, a small contribution for the guest of honors. The contribution was a tiny wooden spoon, carved by hand, with the name</w:t>
       </w:r>
       <w:r>
         <w:t xml:space="preserve"> </w:t>
@@ -9756,21 +9652,21 @@
         <w:t xml:space="preserve">“</w:t>
       </w:r>
       <w:r>
-        <w:t xml:space="preserve">What if nobody buys it?</w:t>
-      </w:r>
-      <w:r>
-        <w:t xml:space="preserve">”</w:t>
-      </w:r>
-    </w:p>
-    <w:p>
-      <w:pPr>
-        <w:pStyle w:val="BodyText"/>
-      </w:pPr>
-      <w:r>
-        <w:t xml:space="preserve">“</w:t>
-      </w:r>
-      <w:r>
-        <w:t xml:space="preserve">Then they’ll be very rude to you in front of the whole town,</w:t>
+        <w:t xml:space="preserve">What if it rains on us?</w:t>
+      </w:r>
+      <w:r>
+        <w:t xml:space="preserve">”</w:t>
+      </w:r>
+    </w:p>
+    <w:p>
+      <w:pPr>
+        <w:pStyle w:val="BodyText"/>
+      </w:pPr>
+      <w:r>
+        <w:t xml:space="preserve">“</w:t>
+      </w:r>
+      <w:r>
+        <w:t xml:space="preserve">Then they’ll complain about the price in front of the whole town,</w:t>
       </w:r>
       <w:r>
         <w:t xml:space="preserve">”</w:t>
@@ -9788,18 +9684,18 @@
         <w:t xml:space="preserve">“</w:t>
       </w:r>
       <w:r>
-        <w:t xml:space="preserve">and you’ll cry in the car, and then you’ll come back the next week and sell twice as much. That is how business works. Your grandmother did it for thirty years.</w:t>
-      </w:r>
-      <w:r>
-        <w:t xml:space="preserve">”</w:t>
-      </w:r>
-    </w:p>
-    <w:p>
-      <w:pPr>
-        <w:pStyle w:val="BodyText"/>
-      </w:pPr>
-      <w:r>
-        <w:t xml:space="preserve">Hannah looked at the sign-up sheet pinned to the corkboard by the till. Twenty-two names. Most of them she recognised: the florist from the corner, the woman who ran the paper shop, the two sisters who made soap, Tom Kowalski, who had put his name down for a table of sourdough rolls and then written beneath it, in capitals,</w:t>
+        <w:t xml:space="preserve">and you’ll sell the bread anyway, and you’ll come back the next week and sell twice as much. That is how business works. Your grandmother did it for thirty years.</w:t>
+      </w:r>
+      <w:r>
+        <w:t xml:space="preserve">”</w:t>
+      </w:r>
+    </w:p>
+    <w:p>
+      <w:pPr>
+        <w:pStyle w:val="BodyText"/>
+      </w:pPr>
+      <w:r>
+        <w:t xml:space="preserve">Hannah looked at the sign-up sheet pinned to the corkboard by the till. Twenty-two names. Most of them she recognized: the florist from the corner, the woman who ran the paper shop, the two sisters who made soap, Tom Kowalski, who had put his name down for a table of sourdough rolls and then written beneath it, in capitals,</w:t>
       </w:r>
       <w:r>
         <w:t xml:space="preserve"> </w:t>
@@ -9877,23 +9773,23 @@
         <w:pStyle w:val="BodyText"/>
       </w:pPr>
       <w:r>
-        <w:t xml:space="preserve">The first Saturday of November was bright and cold, with a thin white frost along the kerbs and a sharp wind that carried the smell of woodsmoke from the chimneys on Mill Lane. By eight o’clock the three tables were set up in front of the shops, draped with red cloth, and every surface was covered in bread.</w:t>
-      </w:r>
-    </w:p>
-    <w:p>
-      <w:pPr>
-        <w:pStyle w:val="BodyText"/>
-      </w:pPr>
-      <w:r>
-        <w:t xml:space="preserve">Hannah had been up since four. She had shaped and proofed two hundred rolls, a dozen rye loaves, and eight enormous sourdough boules that had taken three attempts to get right because her grandmother’s old banneton had cracked in the bottom and she had to make a new one out of a laundry basket and a tea towel. Eli had laughed for a full minute when he saw it, then carried the basket up the street with a face of enormous dignity, as though it were a crown.</w:t>
-      </w:r>
-    </w:p>
-    <w:p>
-      <w:pPr>
-        <w:pStyle w:val="BodyText"/>
-      </w:pPr>
-      <w:r>
-        <w:t xml:space="preserve">By nine, the first customers had arrived. By ten, the queue stretched past the hardware store and round the corner onto the square.</w:t>
+        <w:t xml:space="preserve">The first Saturday of November was bright and cold, with a thin white frost along the curbs and a sharp wind that carried the smell of woodsmoke from the chimneys on Mill Lane. By eight o’clock the three tables were set up in front of the shops, draped with red cloth, and every surface was covered in bread.</w:t>
+      </w:r>
+    </w:p>
+    <w:p>
+      <w:pPr>
+        <w:pStyle w:val="BodyText"/>
+      </w:pPr>
+      <w:r>
+        <w:t xml:space="preserve">Hannah had been up since four. She had shaped and proofed two hundred rolls, a dozen rye loaves, and eight enormous sourdough boules that had taken three attempts to get right because her grandmother’s old banneton had cracked in the bottom and she had to make a new one out of a laundry basket and a dish towels. Eli had laughed for a full minute when he saw it, then carried the basket up the street with a face of enormous dignity, as though it were a crown.</w:t>
+      </w:r>
+    </w:p>
+    <w:p>
+      <w:pPr>
+        <w:pStyle w:val="BodyText"/>
+      </w:pPr>
+      <w:r>
+        <w:t xml:space="preserve">By nine, the first customers had arrived. By ten, the line stretched past the hardware store and around the corner onto the square.</w:t>
       </w:r>
     </w:p>
     <w:p>
@@ -10167,7 +10063,7 @@
         <w:pStyle w:val="BodyText"/>
       </w:pPr>
       <w:r>
-        <w:t xml:space="preserve">Hannah laughed and put her arm round his shoulders for a moment. He smelled of flour and cold air, and he was blushing.</w:t>
+        <w:t xml:space="preserve">Hannah laughed and put her arm around his shoulders for a moment. He smelled of flour and cold air, and he was blushing.</w:t>
       </w:r>
     </w:p>
     <w:p>
@@ -10183,7 +10079,7 @@
         <w:pStyle w:val="BodyText"/>
       </w:pPr>
       <w:r>
-        <w:t xml:space="preserve">Eli had brought the generator, as promised, and set it up behind the hardware store’s back wall, where it coughed and grumbled and powered the coffee urn that Mrs. Ortiz had insisted on guarding with a tea towel over her arm. He had also, without being asked, put up a little sign on the front of the hardware store’s stall, which read in careful capitals:</w:t>
+        <w:t xml:space="preserve">Eli had brought the generator, as promised, and set it up behind the hardware store’s back wall, where it coughed and grumbled and powered the coffee urn that Mrs. Ortiz had insisted on guarding with a dish towels over her arm. He had also, without being asked, put up a little sign on the front of the hardware store’s stall, which read in careful capitals:</w:t>
       </w:r>
       <w:r>
         <w:t xml:space="preserve"> </w:t>
@@ -10723,7 +10619,7 @@
         <w:pStyle w:val="BodyText"/>
       </w:pPr>
       <w:r>
-        <w:t xml:space="preserve">They had been working late every night for a week. It had started with the wiring, which Eli had insisted on finishing before the building inspector came round on Friday, and had turned into everything else: the walk-in door, the freezer compressor, the drain in the back room that smelled like a swamp in August. Hannah had discovered that she could cut a tray of rolls with her eyes closed and that Eli could sing every word of an eighties power ballad without once missing a note. She had also discovered that she liked him, which was the most inconvenient discovery of her life.</w:t>
+        <w:t xml:space="preserve">They had been working late every night for a week. It had started with the wiring, which Eli had insisted on finishing before the building inspector came around on Friday, and had turned into everything else: the walk-in door, the freezer compressor, the drain in the back room that smelled like a swamp in August. Hannah had discovered that she could cut a tray of rolls with her eyes closed and that Eli could sing every word of an eighties power ballad without once missing a note. She had also discovered that she liked him, which was the most inconvenient discovery of her life.</w:t>
       </w:r>
     </w:p>
     <w:p>
@@ -10986,7 +10882,7 @@
         <w:t xml:space="preserve">“</w:t>
       </w:r>
       <w:r>
-        <w:t xml:space="preserve">And I think you’ve been here two weeks, and you’ve made bread that makes grown men cry, and you’re terrified that if you stay, you’ll never leave.</w:t>
+        <w:t xml:space="preserve">And I think you’ve been here since the summer, and you’ve made bread that makes grown men cry, and you’re terrified that if you stay, you’ll never leave.</w:t>
       </w:r>
       <w:r>
         <w:t xml:space="preserve">”</w:t>
@@ -11123,7 +11019,7 @@
         <w:pStyle w:val="BodyText"/>
       </w:pPr>
       <w:r>
-        <w:t xml:space="preserve">For a moment neither of them spoke. The oven hummed. The starter bubbled in its jar, a sign that Mabel the second had survived her first week and was settling in. The clock above the sink ticked past eleven-fifteen. Outside, a truck rumbled past on Cutter Street, its headlights sweeping across the window and then gone.</w:t>
+        <w:t xml:space="preserve">For a moment neither of them spoke. The oven hummed. The starter bubbled in its jar, a sign that Mabel the second was thriving two months on and had long since stopped sulking. The clock above the sink ticked past eleven-fifteen. Outside, a truck rumbled past on Cutter Street, its headlights sweeping across the window and then gone.</w:t>
       </w:r>
     </w:p>
     <w:p>
@@ -11773,15 +11669,15 @@
         <w:pStyle w:val="FirstParagraph"/>
       </w:pPr>
       <w:r>
-        <w:t xml:space="preserve">The dog arrived on Thursday, sitting on the bakery step in the rain like he had been waiting for an appointment.</w:t>
-      </w:r>
-    </w:p>
-    <w:p>
-      <w:pPr>
-        <w:pStyle w:val="BodyText"/>
-      </w:pPr>
-      <w:r>
-        <w:t xml:space="preserve">He was a big, shaggy, apricot-colored creature with a tangle of curls, a tail that swept the wet pavement, and a pair of brown eyes so earnest that Hannah opened the door before she had decided whether to. He padded inside as if he owned the place, sniffed the air with great seriousness, and then sat down beside the bread rack and looked up at her expectantly.</w:t>
+        <w:t xml:space="preserve">The dog arrived on Thursday, sitting on the bakery step in the rain like he had been waiting for an appointment. He had walked the length of Cutter Street with Hannah once before, on a Monday in early autumn, and had apparently decided the bakery was the best stop on the route.</w:t>
+      </w:r>
+    </w:p>
+    <w:p>
+      <w:pPr>
+        <w:pStyle w:val="BodyText"/>
+      </w:pPr>
+      <w:r>
+        <w:t xml:space="preserve">He was a big, shaggy, apricot-colored creature with a tangle of curls, a tail that swept the wet sidewalk, and a pair of brown eyes so earnest that Hannah opened the door before she had decided whether to. He padded inside as if he owned the place, sniffed the air with great seriousness, and then sat down beside the bread rack and looked up at her expectantly.</w:t>
       </w:r>
     </w:p>
     <w:p>
@@ -12422,7 +12318,7 @@
         <w:t xml:space="preserve">“</w:t>
       </w:r>
       <w:r>
-        <w:t xml:space="preserve">It was in the middle of July.</w:t>
+        <w:t xml:space="preserve">It was in the middle of August.</w:t>
       </w:r>
       <w:r>
         <w:t xml:space="preserve">”</w:t>
@@ -12759,7 +12655,7 @@
         <w:pStyle w:val="BodyText"/>
       </w:pPr>
       <w:r>
-        <w:t xml:space="preserve">Hannah found out about this on a Tuesday evening in late November, when a sudden storm rolled in off the river and water began to drip through the ceiling of the back office in a steady, patient rhythm. She came across from the bakery with a torch and a bucket and found Eli standing on a stepladder in the middle of the room, his hair plastered to his forehead, a plastic sheet in one hand and a look of profound exhaustion on his face.</w:t>
+        <w:t xml:space="preserve">Hannah found out about this on a Tuesday evening in late November, when a sudden storm rolled in off the river and water began to drip through the ceiling of the back office in a steady, patient rhythm. She came across from the bakery with a flashlight and a bucket and found Eli standing on a stepladder in the middle of the room, his hair plastered to his forehead, a plastic sheet in one hand and a look of profound exhaustion on his face.</w:t>
       </w:r>
     </w:p>
     <w:p>
@@ -12948,7 +12844,7 @@
         <w:t xml:space="preserve">“</w:t>
       </w:r>
       <w:r>
-        <w:t xml:space="preserve">I was thirteen. I stepped on a loose tile and went through the gutter, right down the side of the building, and landed in the bins behind the diner. Mrs. Ortiz pulled me out by the collar and said she was going to tell my father I’d been stealing cheese.</w:t>
+        <w:t xml:space="preserve">I was thirteen. I stepped on a loose tile and went through the gutter, right down the side of the building, and landed in the trash bins behind the diner. Mrs. Ortiz pulled me out by the collar and said she was going to tell my father I’d been stealing cheese.</w:t>
       </w:r>
       <w:r>
         <w:t xml:space="preserve">”</w:t>
@@ -13024,7 +12920,7 @@
         <w:t xml:space="preserve">“</w:t>
       </w:r>
       <w:r>
-        <w:t xml:space="preserve">Mum left when I was nine,</w:t>
+        <w:t xml:space="preserve">Mom left when I was nine,</w:t>
       </w:r>
       <w:r>
         <w:t xml:space="preserve">”</w:t>
@@ -13160,7 +13056,7 @@
         <w:t xml:space="preserve">“</w:t>
       </w:r>
       <w:r>
-        <w:t xml:space="preserve">Not once. I was too proud. I thought if I said it out loud, he’d leave the way Mum had, and I’d be standing in the rain with nobody to hand the tar to.</w:t>
+        <w:t xml:space="preserve">Not once. I was too proud. I thought if I said it out loud, he’d leave the way Mom had, and I’d be standing in the rain with nobody to hand the tar to.</w:t>
       </w:r>
       <w:r>
         <w:t xml:space="preserve">”</w:t>
@@ -13347,7 +13243,7 @@
         <w:pStyle w:val="BodyText"/>
       </w:pPr>
       <w:r>
-        <w:t xml:space="preserve">The rooms above the hardware store had been empty since his father’s death, Hannah realised, as he led her up the narrow stairs and through a door at the top. There was a kitchen with a formica table and two chairs, a sitting room with a sagging sofa and a radio the size of a small suitcase, and, at the back, a bedroom with a single window looking out over the river and the roofs of Cutter Street.</w:t>
+        <w:t xml:space="preserve">The rooms above the hardware store had been empty since his father’s death, Hannah realized, as he led her up the narrow stairs and through a door at the top. There was a kitchen with a formica table and two chairs, a sitting room with a sagging sofa and a radio the size of a small suitcase, and, at the back, a bedroom with a single window looking out over the river and the roofs of Cutter Street.</w:t>
       </w:r>
     </w:p>
     <w:p>
@@ -13519,7 +13415,7 @@
         <w:pStyle w:val="BodyText"/>
       </w:pPr>
       <w:r>
-        <w:t xml:space="preserve">He looked at her for a long moment in the lamplight. Then he crossed the room, very slowly, as though he were afraid the floor might give way, and put his arms round her, and held on, while outside the rain stopped completely and the whole street went quiet, listening.</w:t>
+        <w:t xml:space="preserve">He looked at her for a long moment in the lamplight. Then he crossed the room, very slowly, as though he were afraid the floor might give way, and put his arms around her, and held on, while outside the rain stopped completely and the whole street went quiet, listening.</w:t>
       </w:r>
     </w:p>
     <w:bookmarkEnd w:id="33"/>
@@ -13561,7 +13457,7 @@
         <w:pStyle w:val="BodyText"/>
       </w:pPr>
       <w:r>
-        <w:t xml:space="preserve">Hannah sat in the third row beside Mrs. Ortiz, who had insisted on bringing a thermos of tea and a bag of ginger biscuits. Biscuit had been left at home, under protest, with a strict instruction from Tom Kowalski to stay out of the feed store. Eli sat on the far side of the aisle, alone, his arms crossed and his face unreadable.</w:t>
+        <w:t xml:space="preserve">Hannah sat in the third row beside Mrs. Ortiz, who had insisted on bringing a thermos of tea and a bag of ginger cookies. Biscuit had been left at home, under protest, with a strict instruction from Tom Kowalski to stay out of the feed store. Eli sat on the far side of the aisle, alone, his arms crossed and his face unreadable.</w:t>
       </w:r>
     </w:p>
     <w:p>
@@ -14980,7 +14876,7 @@
         <w:t xml:space="preserve">“</w:t>
       </w:r>
       <w:r>
-        <w:t xml:space="preserve">I’m supposed to sell the building, Jess. That’s the plan. That’s what Gran’s lawyer wants. That’s what I’ve been planning since I got on the plane. And now there’s a developer with a fancy speech and a woman in a camel coat, and the wiring is a disaster, and the oven’s been running on a prayer, and I’ve got a sourdough starter named after my grandmother and a dog that won’t leave the building.</w:t>
+        <w:t xml:space="preserve">I’m supposed to sell the building, Jess. That’s the plan. That’s what Gran’s lawyer wants. That’s what I’ve been planning since I got on the plane. And now there’s a developer with a fancy speech and a woman in a camel coat, and the wiring is a disaster, and the oven’s been running on a prayer, and I’ve got a sourdough starter with a name and a temper and a dog that won’t leave the building.</w:t>
       </w:r>
       <w:r>
         <w:t xml:space="preserve">”</w:t>
@@ -15443,7 +15339,7 @@
         <w:pStyle w:val="BodyText"/>
       </w:pPr>
       <w:r>
-        <w:t xml:space="preserve">It had been a bright, cold morning in early December, the first properly frosty day of the year, and Biscuit had been lying in his favourite patch of sunshine by the bakery’s back door, snoring gently, with his chin on his paws and one ear twitching at every passing sparrow. Hannah had turned around to fetch a tray of cinnamon rolls from the oven. When she turned back, the patch of sunshine was empty, and the back gate was standing open an inch.</w:t>
+        <w:t xml:space="preserve">It had been a bright, cold morning in early December, the first properly frosty day of the year, and Biscuit had been lying in his favorite patch of sunshine by the bakery’s back door, snoring gently, with his chin on his paws and one ear twitching at every passing sparrow. Hannah had turned around to fetch a tray of cinnamon rolls from the oven. When she turned back, the patch of sunshine was empty, and the back gate was standing open an inch.</w:t>
       </w:r>
     </w:p>
     <w:p>
@@ -15465,7 +15361,7 @@
         <w:pStyle w:val="BodyText"/>
       </w:pPr>
       <w:r>
-        <w:t xml:space="preserve">She ran into the yard. She ran round the front of the shop. She ran up the street to the church and back down again, calling his name until her voice cracked, and by the time she reached the hardware store, the dog was still nowhere to be seen.</w:t>
+        <w:t xml:space="preserve">She ran into the yard. She ran around the front of the shop. She ran up the street to the church and back down again, calling his name until her voice cracked, and by the time she reached the hardware store, the dog was still nowhere to be seen.</w:t>
       </w:r>
     </w:p>
     <w:p>
@@ -15514,7 +15410,7 @@
         <w:t xml:space="preserve">“</w:t>
       </w:r>
       <w:r>
-        <w:t xml:space="preserve">He’s gone, Eli. I turned round for two minutes.</w:t>
+        <w:t xml:space="preserve">He’s gone, Eli. I turned around for two minutes.</w:t>
       </w:r>
       <w:r>
         <w:t xml:space="preserve">”</w:t>
@@ -15619,7 +15515,7 @@
         <w:pStyle w:val="BodyText"/>
       </w:pPr>
       <w:r>
-        <w:t xml:space="preserve">Mrs. Ortiz organised the search with the efficiency of a general. She sent the florist up towards the church and the paper-shop woman down towards the river, and she dispatched the two sisters who made soap to the bins behind the diner, in case he had found the leftover roast chicken. Walt the pigeon man sat on his bench with his cap in his hands and told everybody who passed that he had seen a dog go past the library at about nine, going in the direction of the boatyard, and was quite certain it was not Biscuit, because Biscuit had never been that brave.</w:t>
+        <w:t xml:space="preserve">Mrs. Ortiz organized the search with the efficiency of a general. She sent the florist up towards the church and the paper-shop woman down towards the river, and she dispatched the two sisters who made soap to the trash bins behind the diner, in case he had found the leftover roast chicken. Walt the pigeon man sat on his bench with his cap in his hands and told everybody who passed that he had seen a dog go past the library at about nine, going in the direction of the boatyard, and was quite certain it was not Biscuit, because Biscuit had never been that brave.</w:t>
       </w:r>
     </w:p>
     <w:p>
@@ -15799,7 +15695,7 @@
         <w:pStyle w:val="BodyText"/>
       </w:pPr>
       <w:r>
-        <w:t xml:space="preserve">The fence had a gap at the corner, where someone had kicked out a panel, and the dog had squeezed through it. He was standing in the middle of a churned-up patch of mud with a broken chunk of old brick in his mouth, his tail wagging furiously, and beside him, half-buried in the frozen earth, was something long and grey and dripping, which turned out, on closer inspection, to be the handle of a rusted pump.</w:t>
+        <w:t xml:space="preserve">The fence had a gap at the corner, where someone had kicked out a panel, and the dog had squeezed through it. He was standing in the middle of a churned-up patch of mud with a broken chunk of old brick in his mouth, his tail wagging furiously, and beside him, half-buried in the frozen earth, was something long and gray and dripping, which turned out, on closer inspection, to be the handle of a rusted pump.</w:t>
       </w:r>
     </w:p>
     <w:p>
@@ -16179,7 +16075,7 @@
         <w:pStyle w:val="BodyText"/>
       </w:pPr>
       <w:r>
-        <w:t xml:space="preserve">Eli was silent for a moment, looking out over the grey, churning river.</w:t>
+        <w:t xml:space="preserve">Eli was silent for a moment, looking out over the gray, churning river.</w:t>
       </w:r>
     </w:p>
     <w:p>
@@ -16305,7 +16201,7 @@
         <w:pStyle w:val="BodyText"/>
       </w:pPr>
       <w:r>
-        <w:t xml:space="preserve">They walked back up the hill together, with Biscuit trotting proudly in front of them carrying the sausage roll in his mouth and a clump of wet mud on one ear. At the top of the street, Tom Kowalski came running down from the diner, his face streaked with tears, and when he saw the dog, he dropped to his knees on the pavement and gathered him up in both arms, mud and sausage roll and all.</w:t>
+        <w:t xml:space="preserve">They walked back up the hill together, with Biscuit trotting proudly in front of them carrying the sausage roll in his mouth and a clump of wet mud on one ear. At the top of the street, Tom Kowalski came running down from the diner, his face streaked with tears, and when he saw the dog, he dropped to his knees on the sidewalk and gathered him up in both arms, mud and sausage roll and all.</w:t>
       </w:r>
     </w:p>
     <w:p>
@@ -16516,7 +16412,7 @@
         <w:pStyle w:val="BodyText"/>
       </w:pPr>
       <w:r>
-        <w:t xml:space="preserve">He had come to her apartment that morning, of course. He had arrived at the back of the shop with the radiator parts, a thermos of coffee, and an expression of such careful neutrality that she had almost laughed. They had fixed the heating in a silence that was more companionable than awkward, passing tools back and forth, arguing about the right size of wrench. When it was done, he had stood up, wiped his hands, and said,</w:t>
+        <w:t xml:space="preserve">He had come to the bakery that morning, of course. He had arrived at the back door with the radiator parts, a thermos of coffee, and an expression of such careful neutrality that she had almost laughed. They had fixed the heating in a silence that was more companionable than awkward, passing tools back and forth, arguing about the right size of wrench. When it was done, he had stood up, wiped his hands, and said,</w:t>
       </w:r>
       <w:r>
         <w:t xml:space="preserve"> </w:t>
@@ -16921,7 +16817,7 @@
         <w:t xml:space="preserve">“</w:t>
       </w:r>
       <w:r>
-        <w:t xml:space="preserve">About last night—</w:t>
+        <w:t xml:space="preserve">About this morning—</w:t>
       </w:r>
       <w:r>
         <w:t xml:space="preserve">”</w:t>
@@ -17407,7 +17303,7 @@
         <w:t xml:space="preserve">“</w:t>
       </w:r>
       <w:r>
-        <w:t xml:space="preserve">You’ve been here for three weeks, and you haven’t left once. Not even when you should have.</w:t>
+        <w:t xml:space="preserve">You’ve been here since the summer, and you haven’t left once. Not even when you should have.</w:t>
       </w:r>
       <w:r>
         <w:t xml:space="preserve">”</w:t>
@@ -17566,7 +17462,7 @@
         <w:pStyle w:val="FirstParagraph"/>
       </w:pPr>
       <w:r>
-        <w:t xml:space="preserve">The county archive kept its oldest photographs in a grey steel cabinet on the bottom floor, and Mrs. Ortiz had the key.</w:t>
+        <w:t xml:space="preserve">The county archive kept its oldest photographs in a gray steel cabinet on the bottom floor, and Mrs. Ortiz had the key.</w:t>
       </w:r>
     </w:p>
     <w:p>
@@ -17632,7 +17528,7 @@
         <w:t xml:space="preserve"> </w:t>
       </w:r>
       <w:r>
-        <w:t xml:space="preserve">said Mrs. Ortiz, and pulled out a grey cardboard box with the words</w:t>
+        <w:t xml:space="preserve">said Mrs. Ortiz, and pulled out a gray cardboard box with the words</w:t>
       </w:r>
       <w:r>
         <w:t xml:space="preserve"> </w:t>
@@ -17676,7 +17572,7 @@
         <w:pStyle w:val="BodyText"/>
       </w:pPr>
       <w:r>
-        <w:t xml:space="preserve">Mrs. Ortiz lifted the lid of the box. Inside were dozens of photographs, black and white and fading to sepia, each one tucked into a paper sleeve, each one labelled in a careful hand.</w:t>
+        <w:t xml:space="preserve">Mrs. Ortiz lifted the lid of the box. Inside were dozens of photographs, black and white and fading to sepia, each one tucked into a paper sleeve, each one labeled in a careful hand.</w:t>
       </w:r>
     </w:p>
     <w:p>
@@ -17915,7 +17811,7 @@
         <w:t xml:space="preserve">“</w:t>
       </w:r>
       <w:r>
-        <w:t xml:space="preserve">was the first baker’s boy Dorothy ever hired. He was seventeen, and he couldn’t tell a rye from a rolling pin, and he sang Spanish love songs in the back room at five in the morning until she threw a tea towel at him. Then he learned to bake, and he never stopped singing. He was the happiest man I ever met.</w:t>
+        <w:t xml:space="preserve">was the first baker’s boy Dorothy ever hired. He was seventeen, and he couldn’t tell a rye from a rolling pin, and he sang Spanish love songs in the back room at five in the morning until she threw a dish towels at him. Then he learned to bake, and he never stopped singing. He was the happiest man I ever met.</w:t>
       </w:r>
       <w:r>
         <w:t xml:space="preserve">”</w:t>
@@ -17943,7 +17839,7 @@
         <w:t xml:space="preserve">“</w:t>
       </w:r>
       <w:r>
-        <w:t xml:space="preserve">I was married to a baker for thirty-one years, and then I was married to a diner for twenty more,</w:t>
+        <w:t xml:space="preserve">I was married to a baker for thirty-one years, and since then I have been married to a diner,</w:t>
       </w:r>
       <w:r>
         <w:t xml:space="preserve">”</w:t>
@@ -18192,7 +18088,7 @@
         <w:pStyle w:val="BodyText"/>
       </w:pPr>
       <w:r>
-        <w:t xml:space="preserve">They worked through the rest of the box in silence. There were photographs of the bakery’s first Christmas, with the children of the street crowding round the counter, and the first Winter Harvest, with the band playing on the church steps and the lamps strung across the road. There were pictures of Hollis Carver in his hardware store, leaning over a counter with his big hands folded and a look of quiet pride, and a photograph of him and Dorothy standing side by side outside the bakery, laughing at something beyond the frame.</w:t>
+        <w:t xml:space="preserve">They worked through the rest of the box in silence. There were photographs of the bakery’s first Christmas, with the children of the street crowding around the counter, and the first Winter Harvest, with the band playing on the church steps and the lamps strung across the road. There were pictures of Hollis Carver in his hardware store, leaning over a counter with his big hands folded and a look of quiet pride, and a photograph of him and Dorothy standing side by side outside the bakery, laughing at something beyond the frame.</w:t>
       </w:r>
     </w:p>
     <w:p>
@@ -18502,7 +18398,7 @@
         <w:pStyle w:val="BodyText"/>
       </w:pPr>
       <w:r>
-        <w:t xml:space="preserve">Hannah laughed, and let herself be steered towards the diner’s steamed-up window, and did not look back at the archive, where a grey box of photographs sat waiting in the dark, patiently holding the history of a street that had decided, at last, to stay.</w:t>
+        <w:t xml:space="preserve">Hannah laughed, and let herself be steered towards the diner’s steamed-up window, and did not look back at the archive, where a gray box of photographs sat waiting in the dark, patiently holding the history of a street that had decided, at last, to stay.</w:t>
       </w:r>
     </w:p>
     <w:bookmarkEnd w:id="38"/>
@@ -20333,7 +20229,7 @@
         <w:t xml:space="preserve"> </w:t>
       </w:r>
       <w:r>
-        <w:t xml:space="preserve">He flicked on the lights. Long oak tables stretched under the windows, each one stacked with grey archive boxes labelled in faded ink.</w:t>
+        <w:t xml:space="preserve">He flicked on the lights. Long oak tables stretched under the windows, each one stacked with gray archive boxes labeled in faded ink.</w:t>
       </w:r>
       <w:r>
         <w:t xml:space="preserve"> </w:t>
@@ -20460,7 +20356,7 @@
         <w:t xml:space="preserve">“</w:t>
       </w:r>
       <w:r>
-        <w:t xml:space="preserve">It’s binding on every owner who comes after her, forever, unless the trust agrees to release it. The building can be sold, rented, repaired, painted any colour the city allows. But it cannot be demolished. It cannot be converted into anything that changes the front of the building or the back of the lot. And any commercial redevelopment of the block needs the trust’s written consent.</w:t>
+        <w:t xml:space="preserve">It’s binding on every owner who comes after her, forever, unless the trust agrees to release it. The building can be sold, rented, repaired, painted any color the city allows. But it cannot be demolished. It cannot be converted into anything that changes the front of the building or the back of the lot. And any commercial redevelopment of the block needs the trust’s written consent.</w:t>
       </w:r>
       <w:r>
         <w:t xml:space="preserve">”</w:t>
@@ -21300,7 +21196,7 @@
         <w:pStyle w:val="BodyText"/>
       </w:pPr>
       <w:r>
-        <w:t xml:space="preserve">When they finally carried the boxes back down the stairs and out into the cold, the sky over the river had turned a deep, bruised violet, and the lights were coming on along Cutter Street one by one. Eli stopped on the pavement and looked up at the bakery’s sign, the red paint faded almost to pink above the door.</w:t>
+        <w:t xml:space="preserve">When they finally carried the boxes back down the stairs and out into the cold, the sky over the river had turned a deep, bruised violet, and the lights were coming on along Cutter Street one by one. Eli stopped on the sidewalk and looked up at the bakery’s sign, the red paint faded almost to pink above the door.</w:t>
       </w:r>
     </w:p>
     <w:p>
@@ -21502,15 +21398,15 @@
         <w:pStyle w:val="FirstParagraph"/>
       </w:pPr>
       <w:r>
-        <w:t xml:space="preserve">The inspector from Columbus arrived on the second Monday of December in a grey state car, with a clipboard, a hard hat, and a pair of wellington boots so new they squeaked on the frozen ground.</w:t>
-      </w:r>
-    </w:p>
-    <w:p>
-      <w:pPr>
-        <w:pStyle w:val="BodyText"/>
-      </w:pPr>
-      <w:r>
-        <w:t xml:space="preserve">His name was Dale Henner. He was sixty-three years old, thin as a rake, with a neat grey moustache and the quiet, unhurried manner of a man who had spent forty years listening to walls. He had inspected the mill race wall in 1994, when he was twenty-one years younger and had a full head of black hair, and he had been trying to find an excuse to come back ever since.</w:t>
+        <w:t xml:space="preserve">The inspector from Columbus arrived on the second Monday of December in a gray state car, with a clipboard, a hard hat, and a pair of rubber boots so new they squeaked on the frozen ground.</w:t>
+      </w:r>
+    </w:p>
+    <w:p>
+      <w:pPr>
+        <w:pStyle w:val="BodyText"/>
+      </w:pPr>
+      <w:r>
+        <w:t xml:space="preserve">His name was Dale Henner. He was sixty-three years old, thin as a rake, with a neat gray mustache and the quiet, unhurried manner of a man who had spent forty years listening to walls. He had inspected the mill race wall in 1994, when he was thirty-one and had a full head of black hair, and he had been trying to find an excuse to come back ever since.</w:t>
       </w:r>
     </w:p>
     <w:p>
@@ -21539,7 +21435,7 @@
         <w:t xml:space="preserve">“</w:t>
       </w:r>
       <w:r>
-        <w:t xml:space="preserve">Your father bought me coffee every time I came through town. Terrible coffee. He’d apologise for it, and I’d say it was the best cup I’d had all year, and he’d laugh at me.</w:t>
+        <w:t xml:space="preserve">Your father bought me coffee every time I came through town. Terrible coffee. He’d apologize for it, and I’d say it was the best cup I’d had all year, and he’d laugh at me.</w:t>
       </w:r>
       <w:r>
         <w:t xml:space="preserve">”</w:t>
@@ -21796,7 +21692,7 @@
         <w:pStyle w:val="BodyText"/>
       </w:pPr>
       <w:r>
-        <w:t xml:space="preserve">They spent the rest of the morning on the bank. The inspector drilled three test holes with a hand auger, marking each sample with a careful number, and the cold wind blew the mud up in sheets across the boatyard lot until everyone’s faces were grey.</w:t>
+        <w:t xml:space="preserve">They spent the rest of the morning on the bank. The inspector drilled three test holes with a hand auger, marking each sample with a careful number, and the cold wind blew the mud up in sheets across the boatyard lot until everyone’s faces were gray.</w:t>
       </w:r>
     </w:p>
     <w:p>
@@ -21812,7 +21708,7 @@
         <w:pStyle w:val="BodyText"/>
       </w:pPr>
       <w:r>
-        <w:t xml:space="preserve">At noon, Walt came down from the library with a flask of tea and a paper bag of biscuits, and stood at the edge of the trench with his cap in his hands, watching the inspector work.</w:t>
+        <w:t xml:space="preserve">At noon, Walt came down from the library with a flask of tea and a paper bag of cookies, and stood at the edge of the trench with his cap in his hands, watching the inspector work.</w:t>
       </w:r>
     </w:p>
     <w:p>
@@ -21872,7 +21768,7 @@
         <w:pStyle w:val="BodyText"/>
       </w:pPr>
       <w:r>
-        <w:t xml:space="preserve">Walt nodded slowly. He was silent for a long moment, looking at the grey river rushing past the boatyard, the water high and brown with the winter rain.</w:t>
+        <w:t xml:space="preserve">Walt nodded slowly. He was silent for a long moment, looking at the gray river rushing past the boatyard, the water high and brown with the winter rain.</w:t>
       </w:r>
     </w:p>
     <w:p>
@@ -21910,7 +21806,7 @@
         <w:t xml:space="preserve"> </w:t>
       </w:r>
       <w:r>
-        <w:t xml:space="preserve">His voice was steady, but his hands shook as he turned the cap round.</w:t>
+        <w:t xml:space="preserve">His voice was steady, but his hands shook as he turned the cap around.</w:t>
       </w:r>
       <w:r>
         <w:t xml:space="preserve"> </w:t>
@@ -21970,7 +21866,7 @@
         <w:pStyle w:val="BodyText"/>
       </w:pPr>
       <w:r>
-        <w:t xml:space="preserve">Walt looked at her for a long moment. Then he nodded, very slowly, and gave her one of his biscuits.</w:t>
+        <w:t xml:space="preserve">Walt looked at her for a long moment. Then he nodded, very slowly, and gave her one of his cookies.</w:t>
       </w:r>
     </w:p>
     <w:p>
@@ -22037,7 +21933,7 @@
         <w:t xml:space="preserve">“</w:t>
       </w:r>
       <w:r>
-        <w:t xml:space="preserve">She sat in my office for two hours. She had a box of papers on her knees and a face like thunder. She said Pike had been trying to buy the block for years, and that his people had been poking round the bank, and she wanted to know whether the wall was safe.</w:t>
+        <w:t xml:space="preserve">She sat in my office for two hours. She had a box of papers on her knees and a face like thunder. She said Pike had been trying to buy the block for years, and that his people had been poking around the bank, and she wanted to know whether the wall was safe.</w:t>
       </w:r>
       <w:r>
         <w:t xml:space="preserve">”</w:t>
@@ -22176,7 +22072,7 @@
         <w:pStyle w:val="BodyText"/>
       </w:pPr>
       <w:r>
-        <w:t xml:space="preserve">The car pulled away, slowly, across the frozen ground, and Hannah stood on the edge of the boatyard lot with the cold biting through her coat and the grey river roaring behind her, and understood, at last, what her grandmother had been doing for the last five years of her life.</w:t>
+        <w:t xml:space="preserve">The car pulled away, slowly, across the frozen ground, and Hannah stood on the edge of the boatyard lot with the cold biting through her coat and the gray river roaring behind her, and understood, at last, what her grandmother had been doing for the last five years of her life.</w:t>
       </w:r>
     </w:p>
     <w:p>
@@ -22262,7 +22158,7 @@
         <w:pStyle w:val="FirstParagraph"/>
       </w:pPr>
       <w:r>
-        <w:t xml:space="preserve">The offer arrived on a Tuesday, in a cream-coloured envelope with a gold foil crest, and Hannah read it standing up in the kitchen with a tray of cinnamon rolls cooling on the counter behind her.</w:t>
+        <w:t xml:space="preserve">The offer arrived on a Tuesday, in a cream-color envelope with a gold foil crest, and Hannah read it standing up in the kitchen with a tray of cinnamon rolls cooling on the counter behind her.</w:t>
       </w:r>
     </w:p>
     <w:p>
@@ -22496,7 +22392,7 @@
         <w:t xml:space="preserve"> </w:t>
       </w:r>
       <w:r>
-        <w:t xml:space="preserve">said Hannah, and realised as she said it that it was the truth.</w:t>
+        <w:t xml:space="preserve">said Hannah, and realized as she said it that it was the truth.</w:t>
       </w:r>
       <w:r>
         <w:t xml:space="preserve"> </w:t>
@@ -22734,7 +22630,7 @@
           <w:iCs/>
           <w:i/>
         </w:rPr>
-        <w:t xml:space="preserve">Be careful on the train. The heating’s terrible on the second carriage, I checked it once. Don’t let them give you a cold seat.</w:t>
+        <w:t xml:space="preserve">Be careful on the train. The heating’s terrible on the second car, I checked it once. Don’t let them give you a cold seat.</w:t>
       </w:r>
     </w:p>
     <w:p>
@@ -22947,7 +22843,7 @@
         <w:pStyle w:val="BodyText"/>
       </w:pPr>
       <w:r>
-        <w:t xml:space="preserve">She closed the brief and set it on the table between them. Outside, the lake was grey and endless, and a single freighter crawled across the horizon like a slow, patient animal.</w:t>
+        <w:t xml:space="preserve">She closed the brief and set it on the table between them. Outside, the lake was gray and endless, and a single freighter crawled across the horizon like a slow, patient animal.</w:t>
       </w:r>
     </w:p>
     <w:p>
@@ -22996,7 +22892,7 @@
         <w:t xml:space="preserve">“</w:t>
       </w:r>
       <w:r>
-        <w:t xml:space="preserve">I know he’s got a town meeting next month and a lot of very eager local partners. I know the old bakery is the last holdout.</w:t>
+        <w:t xml:space="preserve">I know he’s got a second town meeting next month and a lot of very eager local partners. I know the old bakery is the last holdout.</w:t>
       </w:r>
       <w:r>
         <w:t xml:space="preserve">”</w:t>
@@ -23237,7 +23133,7 @@
         <w:pStyle w:val="BodyText"/>
       </w:pPr>
       <w:r>
-        <w:t xml:space="preserve">She sat on a bench by the river for an hour afterwards, watching the ice break up under the bridge and drift away in grey, glittering plates. She thought about the first time she had walked into the firm’s offices, twenty-two years old and terrified, with a suitcase full of borrowed dresses and a head full of ambition. She thought about the galas she had planned, the champagne towers and the dazzling lights, the speeches she had written for people who did not believe a single word of them. She thought about her grandmother standing at the oven at five in the morning, humming badly, with flour on her cheek and a cup of tea going cold on the sill.</w:t>
+        <w:t xml:space="preserve">She sat on a bench by the river for an hour afterwards, watching the ice break up under the bridge and drift away in gray, glittering plates. She thought about the first time she had walked into the firm’s offices, twenty-two years old and terrified, with a suitcase full of borrowed dresses and a head full of ambition. She thought about the galas she had planned, the champagne towers and the dazzling lights, the speeches she had written for people who did not believe a single word of them. She thought about her grandmother standing at the oven at five in the morning, humming badly, with flour on her cheek and a cup of tea going cold on the sill.</w:t>
       </w:r>
     </w:p>
     <w:p>
@@ -23255,7 +23151,7 @@
           <w:iCs/>
           <w:i/>
         </w:rPr>
-        <w:t xml:space="preserve">I’m the one who had to open it.</w:t>
+        <w:t xml:space="preserve">I’d be the one who had to open it.</w:t>
       </w:r>
     </w:p>
     <w:p>
@@ -23555,7 +23451,7 @@
         <w:t xml:space="preserve"> </w:t>
       </w:r>
       <w:r>
-        <w:t xml:space="preserve">said Eli, and turned towards the car park.</w:t>
+        <w:t xml:space="preserve">said Eli, and turned towards the parking lot.</w:t>
       </w:r>
       <w:r>
         <w:t xml:space="preserve"> </w:t>
@@ -23683,7 +23579,7 @@
         <w:pStyle w:val="BodyText"/>
       </w:pPr>
       <w:r>
-        <w:t xml:space="preserve">The millpond sat at the edge of town, behind the old grain mill and the line of frosted willows, and by seven o’clock the whole village seemed to have made its way down the snowy footpath with thermoses and torches and a battered portable speaker playing old Motown songs. A dozen children were already flying across the ice in mismatched boots, shrieking with delight. A few older couples stood near the bonfire with their hands wrapped round paper cups, laughing at something the vicar had just said.</w:t>
+        <w:t xml:space="preserve">The millpond sat at the edge of town, behind the old grain mill and the line of frosted willows, and by seven o’clock the whole village seemed to have made its way down the snowy footpath with thermoses and torches and a battered portable speaker playing old Motown songs. A dozen children were already flying across the ice in mismatched boots, shrieking with delight. A few older couples stood near the bonfire with their hands wrapped around paper cups, laughing at something the vicar had just said.</w:t>
       </w:r>
     </w:p>
     <w:p>
@@ -23759,7 +23655,7 @@
         <w:pStyle w:val="BodyText"/>
       </w:pPr>
       <w:r>
-        <w:t xml:space="preserve">She sat on a log by the fire and laced them up, badly, while Eli knelt beside her and redid the knots with quick, practised fingers. When he finished, he looked up at her, and she saw that his face was flushed from the cold and that he was trying very hard not to smile.</w:t>
+        <w:t xml:space="preserve">She sat on a log by the fire and laced them up, badly, while Eli knelt beside her and redid the knots with quick, practiced fingers. When he finished, he looked up at her, and she saw that his face was flushed from the cold and that he was trying very hard not to smile.</w:t>
       </w:r>
     </w:p>
     <w:p>
@@ -23804,7 +23700,7 @@
         <w:t xml:space="preserve">“</w:t>
       </w:r>
       <w:r>
-        <w:t xml:space="preserve">That’s the cruellest thing you’ve ever said to me.</w:t>
+        <w:t xml:space="preserve">That’s the cruelest thing you’ve ever said to me.</w:t>
       </w:r>
       <w:r>
         <w:t xml:space="preserve">”</w:t>
@@ -23963,7 +23859,7 @@
         <w:pStyle w:val="BodyText"/>
       </w:pPr>
       <w:r>
-        <w:t xml:space="preserve">They went round the edge of the pond, slowly, her hands locked in his and her ankles wobbling like a newborn foal. The children whizzed past. The bonfire crackled and popped. The music drifted across the water, a soft, sweet crooning that made the whole scene feel like the inside of an old photograph.</w:t>
+        <w:t xml:space="preserve">They went around the edge of the pond, slowly, her hands locked in his and her ankles wobbling like a newborn foal. The children whizzed past. The bonfire crackled and popped. The music drifted across the water, a soft, sweet crooning that made the whole scene feel like the inside of an old photograph.</w:t>
       </w:r>
     </w:p>
     <w:p>
@@ -24062,7 +23958,7 @@
         <w:t xml:space="preserve">“</w:t>
       </w:r>
       <w:r>
-        <w:t xml:space="preserve">Then she left in the spring, and I didn’t see her again until I was twenty-two. She sent a postcard from Florida once. It said</w:t>
+        <w:t xml:space="preserve">Then she left in the spring, when I was nine, and I didn’t see her again until I was twenty-two. She sent a postcard from Florida once. It said</w:t>
       </w:r>
       <w:r>
         <w:t xml:space="preserve"> </w:t>
@@ -24584,7 +24480,7 @@
         <w:pStyle w:val="BodyText"/>
       </w:pPr>
       <w:r>
-        <w:t xml:space="preserve">She stopped on the pavement and looked at him, and he looked back, and for once neither of them found anything to say that needed saying.</w:t>
+        <w:t xml:space="preserve">She stopped on the sidewalk and looked at him, and he looked back, and for once neither of them found anything to say that needed saying.</w:t>
       </w:r>
     </w:p>
     <w:p>
@@ -24839,7 +24735,7 @@
         <w:pStyle w:val="BodyText"/>
       </w:pPr>
       <w:r>
-        <w:t xml:space="preserve">The vicar called, asking whether the church could be a collection point for the Saturday loaves. Jess called from Dayton, demanding to know whether the surprise monthly item could be a cinnamon roll shaped like a dog. The woman who ran the library called to ask whether she could have twelve loaves for the reading group, and whether the bread would still be warm if she came at eleven. The owner of the hardware store across the road called to say that he did not want bread, but he had a shelf in his window that was empty and would Hannah like to fill it with a basket of rolls, with a sign that said</w:t>
+        <w:t xml:space="preserve">The vicar called, asking whether the church could be a collection point for the Saturday loaves. Jess called from Dayton, demanding to know whether the surprise monthly item could be a cinnamon roll shaped like a dog. The woman who ran the library called to ask whether she could have twelve loaves for the reading group, and whether the bread would still be warm if she came at eleven. The woman who ran the paper shop called to say that she did not want bread, but she had a shelf in her window that was empty, and would Hannah like to fill it with a basket of rolls, with a sign that said</w:t>
       </w:r>
       <w:r>
         <w:t xml:space="preserve"> </w:t>
@@ -24852,7 +24748,7 @@
         <w:t xml:space="preserve">Dorothy’s Recipe</w:t>
       </w:r>
       <w:r>
-        <w:t xml:space="preserve">, and would she please not tell anyone he had been crying about it.</w:t>
+        <w:t xml:space="preserve">, and would she please not tell anyone she had been crying about it.</w:t>
       </w:r>
     </w:p>
     <w:p>
@@ -24978,7 +24874,7 @@
         <w:t xml:space="preserve"> </w:t>
       </w:r>
       <w:r>
-        <w:t xml:space="preserve">He crossed the kitchen in three long strides and put his arms round her from behind, resting his chin on her shoulder. He smelled of cold metal and wet concrete and the faintly sweet scent of the coffee she had burned that morning.</w:t>
+        <w:t xml:space="preserve">He crossed the kitchen in three long strides and put his arms around her from behind, resting his chin on her shoulder. He smelled of cold metal and wet concrete and the faintly sweet scent of the coffee she had burned that morning.</w:t>
       </w:r>
       <w:r>
         <w:t xml:space="preserve"> </w:t>
@@ -25135,7 +25031,7 @@
         <w:pStyle w:val="BodyText"/>
       </w:pPr>
       <w:r>
-        <w:t xml:space="preserve">Hannah had not expected any of it. She had expected a few neighbours, a few sympathetic customers, a handful of people who came in out of pity and left out of habit. She had not expected the bakery’s back room to fill with the warm, noisy bustle of people carrying bags and boxes and asking after her grandmother, or the way the old men on the bench outside would tip their caps when she walked past, or the children who pressed their noses to the glass and begged for a glimpse of the enormous, golden-brown loaves on the racks.</w:t>
+        <w:t xml:space="preserve">Hannah had not expected any of it. She had expected a few neighbors, a few sympathetic customers, a handful of people who came in out of pity and left out of habit. She had not expected the bakery’s back room to fill with the warm, noisy bustle of people carrying bags and boxes and asking after her grandmother, or the way the old men on the bench outside would tip their caps when she walked past, or the children who pressed their noses to the glass and begged for a glimpse of the enormous, golden-brown loaves on the racks.</w:t>
       </w:r>
     </w:p>
     <w:p>
@@ -26186,25 +26082,25 @@
         <w:t xml:space="preserve">“</w:t>
       </w:r>
       <w:r>
-        <w:t xml:space="preserve">I did. That was a mistake. I thought the easement was a technicality that a good lawyer could get round.</w:t>
-      </w:r>
-      <w:r>
-        <w:t xml:space="preserve">”</w:t>
-      </w:r>
-      <w:r>
-        <w:t xml:space="preserve"> </w:t>
-      </w:r>
-      <w:r>
-        <w:t xml:space="preserve">He looked out of the window, at the frosted street and the bakery’s gold-leaf letters glinting in the thin winter light.</w:t>
-      </w:r>
-      <w:r>
-        <w:t xml:space="preserve"> </w:t>
-      </w:r>
-      <w:r>
-        <w:t xml:space="preserve">“</w:t>
-      </w:r>
-      <w:r>
-        <w:t xml:space="preserve">Then I met your Mr. Dorsey, who has the most irritating courtroom manner I’ve ever encountered, and I realised that the easement was not a technicality at all. It was a promise. And your grandmother and Hollis Carver made it in blue ink, in front of witnesses, and they meant it.</w:t>
+        <w:t xml:space="preserve">I did. That was a mistake. I thought the easement was a technicality that a good lawyer could get around.</w:t>
+      </w:r>
+      <w:r>
+        <w:t xml:space="preserve">”</w:t>
+      </w:r>
+      <w:r>
+        <w:t xml:space="preserve"> </w:t>
+      </w:r>
+      <w:r>
+        <w:t xml:space="preserve">He looked out of the window, at the frosted street and the bakery’s faded red letters glinting in the thin winter light.</w:t>
+      </w:r>
+      <w:r>
+        <w:t xml:space="preserve"> </w:t>
+      </w:r>
+      <w:r>
+        <w:t xml:space="preserve">“</w:t>
+      </w:r>
+      <w:r>
+        <w:t xml:space="preserve">Then I met your Mr. Dorsey, who has the most irritating courtroom manner I’ve ever encountered, and I realized that the easement was not a technicality at all. It was a promise. And your grandmother and Hollis Carver made it in blue ink, in front of witnesses, and they meant it.</w:t>
       </w:r>
       <w:r>
         <w:t xml:space="preserve">”</w:t>
@@ -26615,7 +26511,7 @@
         <w:pStyle w:val="BodyText"/>
       </w:pPr>
       <w:r>
-        <w:t xml:space="preserve">It was in her grandmother’s handwriting. Hannah recognised it at once.</w:t>
+        <w:t xml:space="preserve">It was in her grandmother’s handwriting. Hannah recognized it at once.</w:t>
       </w:r>
     </w:p>
     <w:p>
@@ -27041,7 +26937,7 @@
         <w:pStyle w:val="BodyText"/>
       </w:pPr>
       <w:r>
-        <w:t xml:space="preserve">At one o’clock precisely, Mrs. Ortiz arrived in a red coat, carrying a bottle of wine in each hand and a tray of enchiladas balanced on top of her handbag. She took one look at the kitchen, where Eli was standing over a roasting tin with a tea towel over one shoulder and a face of grim determination, and put both bottles down on the table with a heavy thump.</w:t>
+        <w:t xml:space="preserve">At one o’clock precisely, Mrs. Ortiz arrived in a red coat, carrying a bottle of wine in each hand and a tray of enchiladas balanced on top of her handbag. She took one look at the kitchen, where Eli was standing over a roasting tin with a dish towels over one shoulder and a face of grim determination, and put both bottles down on the table with a heavy thump.</w:t>
       </w:r>
     </w:p>
     <w:p>
@@ -27235,7 +27131,7 @@
         <w:pStyle w:val="BodyText"/>
       </w:pPr>
       <w:r>
-        <w:t xml:space="preserve">Edna Price came up the lane with a basket of winter greens from her allotment, and a jar of honey that she set on the table with an air of having been very generous and wanting it noticed. She looked at the roast, then at Eli, then at Hannah, and said,</w:t>
+        <w:t xml:space="preserve">Edna Price came up the lane with a basket of winter greens from her garden plot, and a jar of honey that she set on the table with an air of having been very generous and wanting it noticed. She looked at the roast, then at Eli, then at Hannah, and said,</w:t>
       </w:r>
       <w:r>
         <w:t xml:space="preserve"> </w:t>
@@ -27325,7 +27221,7 @@
         <w:t xml:space="preserve"> </w:t>
       </w:r>
       <w:r>
-        <w:t xml:space="preserve">The vicar came last, in his second-best jumper, carrying a box of mince pies and a bunch of holly that he had clearly stolen from the churchyard hedge.</w:t>
+        <w:t xml:space="preserve">The vicar came last, in his second-best sweater, carrying a box of mince pies and a bunch of holly that he had clearly stolen from the churchyard hedge.</w:t>
       </w:r>
     </w:p>
     <w:p>
@@ -27477,7 +27373,7 @@
         <w:pStyle w:val="BodyText"/>
       </w:pPr>
       <w:r>
-        <w:t xml:space="preserve">Walt looked round at the faces gathered in the warm glow of the fairy lights: the vicar, Edna, Tom with the dog asleep at his feet, Mrs. Ortiz with her arms folded, Eli standing by the stove with his tea towel, Hannah beside him with her hand on his arm.</w:t>
+        <w:t xml:space="preserve">Walt looked around at the faces gathered in the warm glow of the fairy lights: the vicar, Edna, Tom with the dog asleep at his feet, Mrs. Ortiz with her arms folded, Eli standing by the stove with his dish towels, Hannah beside him with her hand on his arm.</w:t>
       </w:r>
     </w:p>
     <w:p>
@@ -28071,7 +27967,7 @@
         <w:pStyle w:val="BodyText"/>
       </w:pPr>
       <w:r>
-        <w:t xml:space="preserve">She was younger, with a neat grey coat, a leather portfolio tucked under one arm, and the bright, careful smile of someone who had been told to be charming and was not sure how much charm would be enough. She introduced herself as Caroline Wu, Associate Counsel, and she sat down at the corner table with the air of a woman who expected to be interrupted.</w:t>
+        <w:t xml:space="preserve">She was younger, with a neat gray coat, a leather portfolio tucked under one arm, and the bright, careful smile of someone who had been told to be charming and was not sure how much charm would be enough. She introduced herself as Caroline Wu, Associate Counsel, and she sat down at the corner table with the air of a woman who expected to be interrupted.</w:t>
       </w:r>
     </w:p>
     <w:p>
@@ -28506,7 +28402,7 @@
         <w:t xml:space="preserve">“</w:t>
       </w:r>
       <w:r>
-        <w:t xml:space="preserve">He had the clerk check whether it still existed. He sent his assistants round the county records office to see if anybody had ever read the trust deed. He’s been trying to get round it since before I came home.</w:t>
+        <w:t xml:space="preserve">He had the clerk check whether it still existed. He sent his assistants around the county records office to see if anybody had ever read the trust deed. He’s been trying to get around it since before I came home.</w:t>
       </w:r>
       <w:r>
         <w:t xml:space="preserve">”</w:t>
@@ -28673,7 +28569,7 @@
         <w:pStyle w:val="BodyText"/>
       </w:pPr>
       <w:r>
-        <w:t xml:space="preserve">Caroline Wu stood up and buttoned her grey coat. At the door, she paused, with one gloved hand on the frame, and looked back over her shoulder at Hannah with an expression that was not quite pity and not quite warmth.</w:t>
+        <w:t xml:space="preserve">Caroline Wu stood up and buttoned her gray coat. At the door, she paused, with one gloved hand on the frame, and looked back over her shoulder at Hannah with an expression that was not quite pity and not quite warmth.</w:t>
       </w:r>
     </w:p>
     <w:p>
@@ -28773,7 +28669,7 @@
         <w:pStyle w:val="BodyText"/>
       </w:pPr>
       <w:r>
-        <w:t xml:space="preserve">Then she folded the invoice in half, put it in an envelope, addressed it to Marian Lowell at the firm’s Michigan Avenue office, and walked it down to the post box on the corner in the freezing dark, without telling a single soul.</w:t>
+        <w:t xml:space="preserve">Then she folded the invoice in half, put it in an envelope, addressed it to Marian Lowell at the firm’s Michigan Avenue office, and walked it down to the mailbox on the corner in the freezing dark, without telling a single soul.</w:t>
       </w:r>
     </w:p>
     <w:p>
@@ -28871,7 +28767,7 @@
         <w:t xml:space="preserve"> </w:t>
       </w:r>
       <w:r>
-        <w:t xml:space="preserve">said a bright, cool voice that Eli did not recognise.</w:t>
+        <w:t xml:space="preserve">said a bright, cool voice that Eli did not recognize.</w:t>
       </w:r>
       <w:r>
         <w:t xml:space="preserve"> </w:t>
@@ -29536,7 +29432,7 @@
         <w:t xml:space="preserve"> </w:t>
       </w:r>
       <w:r>
-        <w:t xml:space="preserve">She had a suitcase by the door when I came down for breakfast, and she’d put a note on the counter that said she was sorry about the wrist.</w:t>
+        <w:t xml:space="preserve">She had a suitcase by the door when I came down for breakfast, and she’d left a note on the counter that said she was sorry.</w:t>
       </w:r>
       <w:r>
         <w:t xml:space="preserve">”</w:t>
@@ -29839,7 +29735,7 @@
         <w:pStyle w:val="BodyText"/>
       </w:pPr>
       <w:r>
-        <w:t xml:space="preserve">She opened her mouth to answer. She thought of the envelope dropping through the post box slot, the soft, final sound it made. She thought of Marian’s bright, cool voice on the phone, and the badge that would be ready in the second week, and the apartment in Chicago she had not yet given up, with its cold white tiles and its beautiful view of nothing at all.</w:t>
+        <w:t xml:space="preserve">She opened her mouth to answer. She thought of the envelope dropping through the mailbox slot, the soft, final sound it made. She thought of Marian’s bright, cool voice on the phone, and the badge that would be ready in the second week, and the apartment in Chicago she had not yet given up, with its cold white tiles and its beautiful view of nothing at all.</w:t>
       </w:r>
     </w:p>
     <w:p>
@@ -30003,7 +29899,7 @@
         <w:pStyle w:val="BodyText"/>
       </w:pPr>
       <w:r>
-        <w:t xml:space="preserve">Hannah stood alone in the warm kitchen, with the towels on the table and the dough breathing softly under its cloth. She picked up the phone, looked at Marian’s number on the screen, and then put it down again without dialling.</w:t>
+        <w:t xml:space="preserve">Hannah stood alone in the warm kitchen, with the towels on the table and the dough breathing softly under its cloth. She picked up the phone, looked at Marian’s number on the screen, and then put it down again without dialing.</w:t>
       </w:r>
     </w:p>
     <w:p>
@@ -30093,7 +29989,7 @@
         <w:t xml:space="preserve"> </w:t>
       </w:r>
       <w:r>
-        <w:t xml:space="preserve">She had torn that one into four pieces and dropped them into the bin.</w:t>
+        <w:t xml:space="preserve">She had torn that one into four pieces and dropped them into the trash can.</w:t>
       </w:r>
     </w:p>
     <w:p>
@@ -30276,7 +30172,7 @@
         <w:t xml:space="preserve">“</w:t>
       </w:r>
       <w:r>
-        <w:t xml:space="preserve">I told Eli. About the offer. About the letter I sent in October. I told him I was going to call Marian in the morning and tell her no. And then I didn’t call her. I sat in this kitchen and I cried for an hour and then I went back to bed.</w:t>
+        <w:t xml:space="preserve">I told Eli. About the offer. About the letter I sent last week. I told him I was going to call Marian in the morning and tell her no. And then I didn’t call her. I sat in this kitchen and I cried for an hour and then I went back to bed.</w:t>
       </w:r>
       <w:r>
         <w:t xml:space="preserve">”</w:t>
@@ -30581,7 +30477,7 @@
           <w:iCs/>
           <w:i/>
         </w:rPr>
-        <w:t xml:space="preserve">I don’t expect you to understand. But you taught me, a long time ago, that the best thing you can do for someone is to tell them the truth. So here it is. I’m staying. I’m sorry I took so long to say it. I hope you find someone better than me to run your launch party. They will be very lucky, and they will probably be more organised than I ever was.</w:t>
+        <w:t xml:space="preserve">I don’t expect you to understand. But you taught me, a long time ago, that the best thing you can do for someone is to tell them the truth. So here it is. I’m staying. I’m sorry I took so long to say it. I hope you find someone better than me to run your launch party. They will be very lucky, and they will probably be more organized than I ever was.</w:t>
       </w:r>
     </w:p>
     <w:p>
@@ -30629,7 +30525,7 @@
         <w:pStyle w:val="BodyText"/>
       </w:pPr>
       <w:r>
-        <w:t xml:space="preserve">She folded it into an envelope, sealed it, and wrote Marian’s name across the front in careful capitals. Then she sat for a long time with her hand resting on the envelope, listening to the freezer hum and the radiator tick and the first grey light beginning to creep up over the roofs of Cutter Street.</w:t>
+        <w:t xml:space="preserve">She folded it into an envelope, sealed it, and wrote Marian’s name across the front in careful capitals. Then she sat for a long time with her hand resting on the envelope, listening to the freezer hum and the radiator tick and the first gray light beginning to creep up over the roofs of Cutter Street.</w:t>
       </w:r>
     </w:p>
     <w:p>
@@ -30645,15 +30541,15 @@
         <w:pStyle w:val="BodyText"/>
       </w:pPr>
       <w:r>
-        <w:t xml:space="preserve">At six o’clock, she went down the stairs in her coat, with the envelope in one hand and the dog’s lead in the other, and walked out into the cold.</w:t>
-      </w:r>
-    </w:p>
-    <w:p>
-      <w:pPr>
-        <w:pStyle w:val="BodyText"/>
-      </w:pPr>
-      <w:r>
-        <w:t xml:space="preserve">Biscuit had been waiting for her by the door. He trotted beside her down the frosty pavement, his breath steaming in the air, and did not once try to sniff anything, which she took as a sign of genuine emotional crisis.</w:t>
+        <w:t xml:space="preserve">At six o’clock, she went down the stairs in her coat, with the envelope in one hand and the dog’s leash in the other, and walked out into the cold.</w:t>
+      </w:r>
+    </w:p>
+    <w:p>
+      <w:pPr>
+        <w:pStyle w:val="BodyText"/>
+      </w:pPr>
+      <w:r>
+        <w:t xml:space="preserve">Biscuit had been waiting for her by the door. He trotted beside her down the frosty sidewalk, his breath steaming in the air, and did not once try to sniff anything, which she took as a sign of genuine emotional crisis.</w:t>
       </w:r>
     </w:p>
     <w:p>
@@ -30677,7 +30573,7 @@
         <w:pStyle w:val="BodyText"/>
       </w:pPr>
       <w:r>
-        <w:t xml:space="preserve">Hannah stood on the pavement for a moment, looking at them. Then she pulled the dog’s lead gently, and crossed the road, and went round to the back door, where she knew Eli would be standing with a mug of terrible coffee in his hand, staring at the freezer as though it had personally offended him.</w:t>
+        <w:t xml:space="preserve">Hannah stood on the sidewalk for a moment, looking at them. Then she pulled the dog’s leash gently, and crossed the road, and went around to the back door, where she knew Eli would be standing with a mug of terrible coffee in his hand, staring at the freezer as though it had personally offended him.</w:t>
       </w:r>
     </w:p>
     <w:p>
@@ -30693,7 +30589,7 @@
         <w:pStyle w:val="BodyText"/>
       </w:pPr>
       <w:r>
-        <w:t xml:space="preserve">The door opened almost at once. He was wearing a red wool scarf over an old grey jumper, and his hair was sticking up at the back, and his face when he saw her was so open and so relieved that she forgot, for a moment, what she had come to say.</w:t>
+        <w:t xml:space="preserve">The door opened almost at once. He was wearing a red wool scarf over an old gray sweater, and his hair was sticking up at the back, and his face when he saw her was so open and so relieved that she forgot, for a moment, what she had come to say.</w:t>
       </w:r>
     </w:p>
     <w:p>
@@ -30859,7 +30755,7 @@
         <w:pStyle w:val="BodyText"/>
       </w:pPr>
       <w:r>
-        <w:t xml:space="preserve">He crossed the yard in three long strides, and did not say anything at all. He simply took her face in both his hands, his palms cold and rough and shaking very slightly, and kissed her, under the grey dawn sky, in full view of the dog, the freezer, and the whole of Cutter Street waking slowly around them.</w:t>
+        <w:t xml:space="preserve">He crossed the yard in three long strides, and did not say anything at all. He simply took her face in both his hands, his palms cold and rough and shaking very slightly, and kissed her, under the gray dawn sky, in full view of the dog, the freezer, and the whole of Cutter Street waking slowly around them.</w:t>
       </w:r>
     </w:p>
     <w:p>
@@ -30885,7 +30781,7 @@
         <w:pStyle w:val="FirstParagraph"/>
       </w:pPr>
       <w:r>
-        <w:t xml:space="preserve">The storm came in off the river on the Wednesday before Thanksgiving, and by nine o’clock that evening, Cutter Street had lost its power.</w:t>
+        <w:t xml:space="preserve">The storm came in off the river on the Wednesday before Christmas, and by nine o’clock that evening, Cutter Street had lost its power.</w:t>
       </w:r>
     </w:p>
     <w:p>
@@ -30961,7 +30857,7 @@
         <w:pStyle w:val="BodyText"/>
       </w:pPr>
       <w:r>
-        <w:t xml:space="preserve">Hannah walked to the window and looked out. Across the road, the hardware store was dark. The diner was dark. The church was dark. The only light on Cutter Street was the thin, flickering beam of a single torch, moving slowly down the middle of the road, and it belonged to a man in a yellow hard hat who was walking towards the river with a clipboard under one arm and his collar turned up against the sleet.</w:t>
+        <w:t xml:space="preserve">Hannah walked to the window and looked out. Across the road, the hardware store was dark. The diner was dark. The church was dark. The only light on Cutter Street was the thin, flickering beam of a single flashlight, moving slowly down the middle of the road, and it belonged to a man in a yellow hard hat who was walking towards the river with a clipboard under one arm and his collar turned up against the sleet.</w:t>
       </w:r>
     </w:p>
     <w:p>
@@ -31009,7 +30905,7 @@
         <w:pStyle w:val="BodyText"/>
       </w:pPr>
       <w:r>
-        <w:t xml:space="preserve">Eli got there twenty minutes later, soaked to the skin, with a head torch strapped over his beanie and a face like thunder.</w:t>
+        <w:t xml:space="preserve">Eli got there twenty minutes later, soaked to the skin, with a headlamp strapped over his beanie and a face like thunder.</w:t>
       </w:r>
     </w:p>
     <w:p>
@@ -31297,7 +31193,7 @@
         <w:pStyle w:val="BodyText"/>
       </w:pPr>
       <w:r>
-        <w:t xml:space="preserve">The hardware store was cold and smelled of oil and paint thinner and old brick. Eli had lit the generator in the back room, and it clattered and coughed like an old man clearing his throat, but the light it threw was steady and yellow. He had dragged a folding table into the centre of the floor and covered it with clean sheets. In the corner, under a dusty tarpaulin, was an enormous black iron oven with a cast-iron door, its brick chimney running up through the ceiling.</w:t>
+        <w:t xml:space="preserve">The hardware store was cold and smelled of oil and paint thinner and old brick. Eli had lit the generator in the back room, and it clattered and coughed like an old man clearing his throat, but the light it threw was steady and yellow. He had dragged a folding table into the center of the floor and covered it with clean sheets. In the corner, under a dusty tarpaulin, was an enormous black iron oven with a cast-iron door, its brick chimney running up through the ceiling.</w:t>
       </w:r>
     </w:p>
     <w:p>
@@ -31630,7 +31526,7 @@
         <w:t xml:space="preserve">“</w:t>
       </w:r>
       <w:r>
-        <w:t xml:space="preserve">I sent the letter to Marian,</w:t>
+        <w:t xml:space="preserve">I told Marian I’m staying,</w:t>
       </w:r>
       <w:r>
         <w:t xml:space="preserve">”</w:t>
@@ -31648,25 +31544,7 @@
         <w:t xml:space="preserve">“</w:t>
       </w:r>
       <w:r>
-        <w:t xml:space="preserve">The one about January. I wrote it on the back of an invoice because I was too scared to write it on paper, and I posted it on the corner, and I didn’t tell you, because I was afraid that if I did, you’d look at me the way you’re looking at me now. And I’d have to admit I didn’t trust myself.</w:t>
-      </w:r>
-      <w:r>
-        <w:t xml:space="preserve">”</w:t>
-      </w:r>
-      <w:r>
-        <w:t xml:space="preserve"> </w:t>
-      </w:r>
-      <w:r>
-        <w:t xml:space="preserve">Her voice wobbled.</w:t>
-      </w:r>
-      <w:r>
-        <w:t xml:space="preserve"> </w:t>
-      </w:r>
-      <w:r>
-        <w:t xml:space="preserve">“</w:t>
-      </w:r>
-      <w:r>
-        <w:t xml:space="preserve">I’m sorry. I’m so sorry. I should have said it on the first night, or the second, or any night since. You were right. You were always right. And I’ve been running away from it since I got off that plane.</w:t>
+        <w:t xml:space="preserve">I wrote it down and posted it on the corner, and I should have told you to your face before I did. I was afraid that if I said it out loud, you’d look at me the way you’re looking at me now. I’m sorry. I’m so sorry. I should have said it on the first night, or the second, or any night since. You were right. You were always right. And I’ve been running away from it since I got off that plane.</w:t>
       </w:r>
       <w:r>
         <w:t xml:space="preserve">”</w:t>
@@ -31706,7 +31584,7 @@
         <w:t xml:space="preserve">“</w:t>
       </w:r>
       <w:r>
-        <w:t xml:space="preserve">I’m going to call Marian in the morning and tell her no. I’m going to tell Pike’s counsel that the building isn’t for sale. I’m going to keep the door shut, Eli. Because I don’t want it open anymore.</w:t>
+        <w:t xml:space="preserve">I’ve already told Marian no, and I meant it. Now I’m going to tell Pike’s counsel that the building isn’t for sale. I’m going to keep the door shut, Eli. Because I don’t want it open anymore.</w:t>
       </w:r>
       <w:r>
         <w:t xml:space="preserve">”</w:t>
@@ -31780,7 +31658,7 @@
         <w:t xml:space="preserve">“</w:t>
       </w:r>
       <w:r>
-        <w:t xml:space="preserve">I’m going to have nightmares about the freezer and the boiler and the goddamned feeder line for the rest of my life. And I’m going to keep fixing things that don’t need fixing, and I’m going to burn the toast every single morning, and I’m going to be stubborn about the oven and bossy about the dog and I’m going to make you cold on purpose just to watch you put on your second sweater.</w:t>
+        <w:t xml:space="preserve">I’m going to have nightmares about the freezer and the boiler and the wretched feeder line for the rest of my life. And I’m going to keep fixing things that don’t need fixing, and I’m going to burn the toast every single morning, and I’m going to be stubborn about the oven and bossy about the dog and I’m going to make you cold on purpose just to watch you put on your second sweater.</w:t>
       </w:r>
       <w:r>
         <w:t xml:space="preserve">”</w:t>
@@ -31865,15 +31743,15 @@
         <w:t xml:space="preserve"> </w:t>
       </w:r>
       <w:r>
-        <w:t xml:space="preserve">and then rolled up her sleeves and started shaping loaves without another word. Tom Kowalski came at one with a box of eggs and a tray of rolls he had made himself, badly, and nobody had the heart to tell him so. The vicar came at two, carrying a stack of tea towels, and was made to wash every tray twice.</w:t>
-      </w:r>
-    </w:p>
-    <w:p>
-      <w:pPr>
-        <w:pStyle w:val="BodyText"/>
-      </w:pPr>
-      <w:r>
-        <w:t xml:space="preserve">By the time the first grey light crept through the high, dusty windows of the store, there were three hundred loaves cooling on the racks along the back wall, and the smell of baking bread had filled every corner of the building.</w:t>
+        <w:t xml:space="preserve">and then rolled up her sleeves and started shaping loaves without another word. Tom Kowalski came at one with a box of eggs and a tray of rolls he had made himself, badly, and nobody had the heart to tell him so. The vicar came at two, carrying a stack of dish towels, and was made to wash every tray twice.</w:t>
+      </w:r>
+    </w:p>
+    <w:p>
+      <w:pPr>
+        <w:pStyle w:val="BodyText"/>
+      </w:pPr>
+      <w:r>
+        <w:t xml:space="preserve">By the time the first gray light crept through the high, dusty windows of the store, there were three hundred loaves cooling on the racks along the back wall, and the smell of baking bread had filled every corner of the building.</w:t>
       </w:r>
     </w:p>
     <w:p>
@@ -31963,7 +31841,7 @@
         <w:pStyle w:val="BodyText"/>
       </w:pPr>
       <w:r>
-        <w:t xml:space="preserve">When the power came back at seven, with a soft electric hum and a hundred little lights flickering on across the street, the first thing Hannah saw was the Bread Club queue, already curling round the corner of the church in the frosted dawn, with the vicar’s wife at the front holding a clipboard and Mrs. Ortiz at the back with her arms folded, glaring at anyone who tried to cut in.</w:t>
+        <w:t xml:space="preserve">When the power came back at seven, with a soft electric hum and a hundred little lights flickering on across the street, the first thing Hannah saw was the Bread Club line, already curling around the corner of the church in the frosted dawn, with the vicar’s wife at the front holding a clipboard and Mrs. Ortiz at the back with her arms folded, glaring at anyone who tried to cut in.</w:t>
       </w:r>
     </w:p>
     <w:p>
@@ -32023,7 +31901,7 @@
         <w:pStyle w:val="BodyText"/>
       </w:pPr>
       <w:r>
-        <w:t xml:space="preserve">Hannah sat in the second row, with her hands in her lap and Jess’s arm pressed firmly against hers. Her sister had driven down from Dayton that morning, with her husband and two sleepy children in the back seat, and had hugged Hannah in the car park for so long that Hannah’s ribs still ached.</w:t>
+        <w:t xml:space="preserve">Hannah sat in the second row, with her hands in her lap and Jess’s arm pressed firmly against hers. Her sister had driven down from Dayton that morning, with her husband and two sleepy children in the back seat, and had hugged Hannah in the parking lot for so long that Hannah’s ribs still ached.</w:t>
       </w:r>
     </w:p>
     <w:p>
@@ -32091,7 +31969,7 @@
         <w:pStyle w:val="BodyText"/>
       </w:pPr>
       <w:r>
-        <w:t xml:space="preserve">Eli sat at the front of the room, at a long table beside Mr. Dorsey, with a stack of papers in front of him and a glass of water he had not touched. He wore a dark grey suit that Hannah had never seen before, and it fitted him slightly too well across the shoulders, as if somebody had altered it in a hurry. His hair was still damp from the shower, and he kept pushing it back off his forehead with one hand.</w:t>
+        <w:t xml:space="preserve">Eli sat at the front of the room, at a long table beside Mr. Dorsey, with a stack of papers in front of him and a glass of water he had not touched. He wore a dark gray suit that Hannah had never seen before, and it fitted him slightly too well across the shoulders, as if somebody had altered it in a hurry. His hair was still damp from the shower, and he kept pushing it back off his forehead with one hand.</w:t>
       </w:r>
     </w:p>
     <w:p>
@@ -32155,7 +32033,7 @@
         <w:pStyle w:val="BodyText"/>
       </w:pPr>
       <w:r>
-        <w:t xml:space="preserve">Garrett Pike’s lawyer rose first, a tall, thin man in a navy tie who spoke as if he were reading a menu aloud. He argued that the trust was dormant, that its original trustee had died more than thirty years ago, and that its surviving seat had never been formally filled. He argued that the easement was an historical oddity, unenforceable in practice, and that Mr. Pike’s amended plan preserved the building’s facade and therefore honoured the spirit of the agreement. He argued for twelve minutes and sat down to a murmur of uneasy approval.</w:t>
+        <w:t xml:space="preserve">Garrett Pike’s lawyer rose first, a tall, thin man in a navy tie who spoke as if he were reading a menu aloud. He argued that the trust was dormant, that its original trustee had died more than thirty years ago, and that its surviving seat had never been formally filled. He argued that the easement was an historical oddity, unenforceable in practice, and that Mr. Pike’s amended plan preserved the building’s facade and therefore honored the spirit of the agreement. He argued for twelve minutes and sat down to a murmur of uneasy approval.</w:t>
       </w:r>
     </w:p>
     <w:p>
@@ -32210,7 +32088,7 @@
         <w:t xml:space="preserve">“</w:t>
       </w:r>
       <w:r>
-        <w:t xml:space="preserve">Mr. Eli Carver, son of the late Hollis Carver, was appointed under section six of the trust deed in October. The appointment was witnessed. The records are on file. I have copies for the council.</w:t>
+        <w:t xml:space="preserve">Mr. Eli Carver, son of the late Hollis Carver, was appointed under section six of the trust deed in December. The appointment was witnessed. The records are on file. I have copies for the council.</w:t>
       </w:r>
       <w:r>
         <w:t xml:space="preserve">”</w:t>
@@ -32813,7 +32691,7 @@
         <w:pStyle w:val="BodyText"/>
       </w:pPr>
       <w:r>
-        <w:t xml:space="preserve">They met afterwards in the car park, in the bitter cold, under a flickering lamp that buzzed like a trapped insect.</w:t>
+        <w:t xml:space="preserve">They met afterwards in the parking lot, in the bitter cold, under a flickering lamp that buzzed like a trapped insect.</w:t>
       </w:r>
     </w:p>
     <w:p>
@@ -32909,7 +32787,7 @@
         <w:pStyle w:val="BodyText"/>
       </w:pPr>
       <w:r>
-        <w:t xml:space="preserve">He laughed, weakly, and then pulled her into his arms, right there in the middle of the car park, with the lamp buzzing overhead and Jess’s car pulling out of the space beside them, and the sound of voices drifting from the steps of the council chamber. He held her tightly, his face buried in her hair.</w:t>
+        <w:t xml:space="preserve">He laughed, weakly, and then pulled her into his arms, right there in the middle of the parking lot, with the lamp buzzing overhead and Jess’s car pulling out of the space beside them, and the sound of voices drifting from the steps of the council chamber. He held her tightly, his face buried in her hair.</w:t>
       </w:r>
     </w:p>
     <w:p>
@@ -33106,7 +32984,7 @@
         <w:t xml:space="preserve">“</w:t>
       </w:r>
       <w:r>
-        <w:t xml:space="preserve">and Mrs. Ortiz is going to buy us both a plate of chips and tell us we were terrible, and then we’re going to go back to Cutter Street and sleep for twelve hours.</w:t>
+        <w:t xml:space="preserve">and Mrs. Ortiz is going to buy us both a plate of fries and tell us we were terrible, and then we’re going to go back to Cutter Street and sleep for twelve hours.</w:t>
       </w:r>
       <w:r>
         <w:t xml:space="preserve">”</w:t>
@@ -33358,7 +33236,7 @@
         <w:t xml:space="preserve">“</w:t>
       </w:r>
       <w:r>
-        <w:t xml:space="preserve">I’m very good at it. I could make your grandmother’s neighbours believe the water supply was going to be cut off if they didn’t sell their houses by Easter. I did it in two other towns. I’m not proud of it.</w:t>
+        <w:t xml:space="preserve">I’m very good at it. I could make your grandmother’s neighbors believe the water supply was going to be cut off if they didn’t sell their houses by Easter. I did it in two other towns. I’m not proud of it.</w:t>
       </w:r>
       <w:r>
         <w:t xml:space="preserve">”</w:t>
@@ -33521,7 +33399,7 @@
         <w:pStyle w:val="BodyText"/>
       </w:pPr>
       <w:r>
-        <w:t xml:space="preserve">She opened the folder at last and turned it round so Hannah could see. The first page was a memorandum, typed on heavy paper, dated the previous March. It was headed</w:t>
+        <w:t xml:space="preserve">She opened the folder at last and turned it around so Hannah could see. The first page was a memorandum, typed on heavy paper, dated the previous March. It was headed</w:t>
       </w:r>
       <w:r>
         <w:t xml:space="preserve"> </w:t>
@@ -33603,7 +33481,7 @@
         <w:t xml:space="preserve">“</w:t>
       </w:r>
       <w:r>
-        <w:t xml:space="preserve">Pike knew about the trust. He’s known since before he bought the first building on the block. His father knew about it too. Hollis Carver’s loan from 1989 was the first thing the Pike family ever tried to buy on Cutter Street. They bought the note from a bank in Columbus, hoping to foreclose on the store if the Brooks bakery defaulted. Hollis paid it off before they could. He paid it in cash, and he told the Pike lawyer to go to hell in writing.</w:t>
+        <w:t xml:space="preserve">Pike knew about the trust. He’s known since before he bought the first building on the block. His father knew about it too. Hollis’s 1989 loan to Dorothy was the first thing the Pike family ever tried to buy on Cutter Street. Pike’s father bought the bakery’s back debts from a bank in Columbus, hoping to foreclose if the Brooks bakery defaulted. Hollis paid them off before they could. He paid in cash, and he told the Pike lawyer to take a running jump in writing.</w:t>
       </w:r>
       <w:r>
         <w:t xml:space="preserve">”</w:t>
@@ -34333,7 +34211,7 @@
         <w:t xml:space="preserve">“</w:t>
       </w:r>
       <w:r>
-        <w:t xml:space="preserve">And the file. Pike’s father bought Hollis’s note in 1989. He tried to foreclose on Gran. Hollis paid it off in cash and told the Pike lawyer to go to hell.</w:t>
+        <w:t xml:space="preserve">And the file. Pike’s father bought Gran’s back debts in 1989. He tried to foreclose on her. Hollis paid them off in cash and told the Pike lawyer to take a running jump.</w:t>
       </w:r>
       <w:r>
         <w:t xml:space="preserve">”</w:t>
@@ -34488,7 +34366,7 @@
         <w:pStyle w:val="FirstParagraph"/>
       </w:pPr>
       <w:r>
-        <w:t xml:space="preserve">Jess arrived on Christmas Eve with a car full of presents, two sleepy children in matching pyjamas, a husband named Dan who carried the turkey as if it were a baby, and an expression on her face that made Hannah suspect she had been crying in the car for most of the drive.</w:t>
+        <w:t xml:space="preserve">Jess arrived on Christmas Eve with a car full of presents, two sleepy children in matching pajamas, a husband named Dan who carried the turkey as if it were a baby, and an expression on her face that made Hannah suspect she had been crying in the car for most of the drive.</w:t>
       </w:r>
     </w:p>
     <w:p>
@@ -34619,7 +34497,7 @@
         <w:t xml:space="preserve">“</w:t>
       </w:r>
       <w:r>
-        <w:t xml:space="preserve">It’s made of biscuit.</w:t>
+        <w:t xml:space="preserve">It’s made of cookie.</w:t>
       </w:r>
       <w:r>
         <w:t xml:space="preserve">”</w:t>
@@ -34836,7 +34714,7 @@
         <w:pStyle w:val="BodyText"/>
       </w:pPr>
       <w:r>
-        <w:t xml:space="preserve">They ate in the back room, at a long table pushed together from three smaller ones, with a checked cloth that Mrs. Ortiz had lent them and a row of candles that Hannah had lit against the grey afternoon light. Mrs. Ortiz came with a casserole and a bottle of sherry and the expression of a woman who had planned this dinner in great detail and was prepared to be disappointed by it. The vicar came for pudding. Tom Kowalski came with Biscuit’s red ribbon freshly ironed and a plate of his very own sourdough rolls, which were slightly flattened on one side and which he presented with enormous pride. Everybody ate one. Nobody said a word about the flattened side.</w:t>
+        <w:t xml:space="preserve">They ate in the back room, at a long table pushed together from three smaller ones, with a checked cloth that Mrs. Ortiz had lent them and a row of candles that Hannah had lit against the gray afternoon light. Mrs. Ortiz came with a casserole and a bottle of sherry and the expression of a woman who had planned this dinner in great detail and was prepared to be disappointed by it. The vicar came for dessert. Tom Kowalski came with Biscuit’s red ribbon freshly ironed and a plate of his very own sourdough rolls, which were slightly flattened on one side and which he presented with enormous pride. Everybody ate one. Nobody said a word about the flattened side.</w:t>
       </w:r>
     </w:p>
     <w:p>
@@ -35078,7 +34956,7 @@
         <w:pStyle w:val="BodyText"/>
       </w:pPr>
       <w:r>
-        <w:t xml:space="preserve">She did not sob. She simply stood on the back step of the bakery, with her hands over her face and her shoulders shaking, while the cold air curled around her in clouds of white breath. Hannah put her arms round her sister and held on, the way she had when they were small, when Jess had fallen off the swing and split her lip and Hannah had carried her home on her back all the way down Cutter Street, crying harder than she was.</w:t>
+        <w:t xml:space="preserve">She did not sob. She simply stood on the back step of the bakery, with her hands over her face and her shoulders shaking, while the cold air curled around her in clouds of white breath. Hannah put her arms around her sister and held on, the way she had when they were small, when Jess had fallen off the swing and split her lip and Hannah had carried her home on her back all the way down Cutter Street, crying harder than she was.</w:t>
       </w:r>
     </w:p>
     <w:p>
@@ -35216,7 +35094,7 @@
         <w:pStyle w:val="BodyText"/>
       </w:pPr>
       <w:r>
-        <w:t xml:space="preserve">When they came back inside, the room had gone quiet. Dan was sitting in the corner with a glass of sherry, watching the children curled up on the bench with Biscuit’s head on Lily’s lap. Mrs. Ortiz was dozing over her pudding. The vicar had his eyes closed and was humming to himself.</w:t>
+        <w:t xml:space="preserve">When they came back inside, the room had gone quiet. Dan was sitting in the corner with a glass of sherry, watching the children curled up on the bench with Biscuit’s head on Lily’s lap. Mrs. Ortiz was dozing over her dessert. The vicar had his eyes closed and was humming to himself.</w:t>
       </w:r>
     </w:p>
     <w:p>
@@ -35331,7 +35209,7 @@
         <w:t xml:space="preserve">“</w:t>
       </w:r>
       <w:r>
-        <w:t xml:space="preserve">Under the nail drawers, next to the safe. Dad must have put it there in 1990, after she paid him back. Mr. Dorsey found the receipt for it in the county files. It’s been sitting there for thirty-five years, and nobody ever came to collect it.</w:t>
+        <w:t xml:space="preserve">Under the nail drawers, next to the safe. Dad must have put it there in 1990, after she paid him back. Mr. Dorsey found the receipt for it in the county files. It’s been sitting there for thirty-six years, and nobody ever came to collect it.</w:t>
       </w:r>
       <w:r>
         <w:t xml:space="preserve">”</w:t>
@@ -35715,7 +35593,7 @@
           <w:iCs/>
           <w:i/>
         </w:rPr>
-        <w:t xml:space="preserve">Eli. Sorry about the wrist. I was not brave enough to say it properly then. I am trying now. I have been sober for six years and I am living in a small flat near the water with a cat named Bruce who hates me. I know you don’t want to hear from me. I know I don’t deserve to be heard. But I wanted you to know that I think about the roof, and the tar, and your father carrying you home over his shoulder. I think about it every day. — Mum.</w:t>
+        <w:t xml:space="preserve">Eli. Sorry about the wrist. I was not brave enough to say it properly then. I am trying now. I have been sober for six years and I am living in a small apartment near the water with a cat named Bruce who hates me. I know you don’t want to hear from me. I know I don’t deserve to be heard. But I wanted you to know that I think about the roof, and the tar, and your father carrying you home over his shoulder. I think about it every day. — Mom.</w:t>
       </w:r>
     </w:p>
     <w:p>
@@ -36177,7 +36055,7 @@
           <w:iCs/>
           <w:i/>
         </w:rPr>
-        <w:t xml:space="preserve">Mum,</w:t>
+        <w:t xml:space="preserve">Mom,</w:t>
       </w:r>
     </w:p>
     <w:p>
@@ -36201,7 +36079,7 @@
           <w:iCs/>
           <w:i/>
         </w:rPr>
-        <w:t xml:space="preserve">I’m glad you’re sober. I’m glad you have a flat near the water and a cat who hates you. I hope Bruce is kind to you when you’re not looking.</w:t>
+        <w:t xml:space="preserve">I’m glad you’re sober. I’m glad you have an apartment near the water and a cat who hates you. I hope Bruce is kind to you when you’re not looking.</w:t>
       </w:r>
     </w:p>
     <w:p>
@@ -36407,7 +36285,7 @@
         <w:pStyle w:val="BodyText"/>
       </w:pPr>
       <w:r>
-        <w:t xml:space="preserve">They walked back down the frosty street together, past the diner and the library and the bench where Walt was sitting with his pigeons, and Mrs. Ortiz waved at them from the window with a tea towel in one hand and a look of enormous, unsubtle satisfaction on her face. At the bakery, the morning’s first batch of rye was cooling on the racks, and the gold-leaf sign over the door caught the thin winter sun.</w:t>
+        <w:t xml:space="preserve">They walked back down the frosty street together, past the diner and the library and the bench where Walt was sitting with his pigeons, and Mrs. Ortiz waved at them from the window with a dish towels in one hand and a look of enormous, unsubtle satisfaction on her face. At the bakery, the morning’s first batch of rye was cooling on the racks, and the faded red sign over the door caught the thin winter sun.</w:t>
       </w:r>
     </w:p>
     <w:p>
@@ -36579,7 +36457,7 @@
         <w:pStyle w:val="BodyText"/>
       </w:pPr>
       <w:r>
-        <w:t xml:space="preserve">He kissed her, quickly, on the pavement outside the bakery, and then went off across the road with the bucket on one arm and the dog trotting faithfully at his heels, whistling tunelessly, very badly, the way his father used to whistle on the roof.</w:t>
+        <w:t xml:space="preserve">He kissed her, quickly, on the sidewalk outside the bakery, and then went off across the road with the bucket on one arm and the dog trotting faithfully at his heels, whistling tunelessly, very badly, the way his father used to whistle on the roof.</w:t>
       </w:r>
     </w:p>
     <w:bookmarkEnd w:id="55"/>
@@ -36683,7 +36561,7 @@
         <w:t xml:space="preserve"> </w:t>
       </w:r>
       <w:r>
-        <w:t xml:space="preserve">asked Hannah, from the pavement below.</w:t>
+        <w:t xml:space="preserve">asked Hannah, from the sidewalk below.</w:t>
       </w:r>
     </w:p>
     <w:p>
@@ -36776,7 +36654,7 @@
         <w:pStyle w:val="BodyText"/>
       </w:pPr>
       <w:r>
-        <w:t xml:space="preserve">Hannah stood on the cold pavement with her hands in her coat pockets and watched him work. The January sun was pale and thin, and the frost still lay in patches along the gutters, and across the road, the hardware store’s windows had been freshly washed for the first time in months. In the middle of the window, a small, neat sign had been propped against a bucket of galvanised nails. It read, in Eli’s careful capitals:</w:t>
+        <w:t xml:space="preserve">Hannah stood on the cold sidewalk with her hands in her coat pockets and watched him work. The January sun was pale and thin, and the frost still lay in patches along the gutters, and across the road, the hardware store’s windows had been freshly washed for the first time in months. In the middle of the window, a small, neat sign had been propped against a bucket of galvanized nails. It read, in Eli’s careful capitals:</w:t>
       </w:r>
       <w:r>
         <w:t xml:space="preserve"> </w:t>
@@ -36888,7 +36766,7 @@
         <w:t xml:space="preserve">“</w:t>
       </w:r>
       <w:r>
-        <w:t xml:space="preserve">That’s what it says on the trust deed. Mr. Dorsey brought the design round on Friday. He wanted it done this week. He said it was a surprise, and I wasn’t supposed to tell you.</w:t>
+        <w:t xml:space="preserve">That’s what it says on the trust deed. Mr. Dorsey brought the design around on Friday. He wanted it done this week. He said it was a surprise, and I wasn’t supposed to tell you.</w:t>
       </w:r>
       <w:r>
         <w:t xml:space="preserve">”</w:t>
@@ -36993,7 +36871,7 @@
         <w:pStyle w:val="BodyText"/>
       </w:pPr>
       <w:r>
-        <w:t xml:space="preserve">Eli was in the back office when she came in, on the phone to the county, with a pencil behind one ear and a stack of papers spread across the desk. He held up one finger without looking round, the way he did when he was concentrating, and Hannah stood in the doorway and watched him.</w:t>
+        <w:t xml:space="preserve">Eli was in the back office when she came in, on the phone to the county, with a pencil behind one ear and a stack of papers spread across the desk. He held up one finger without looking around, the way he did when he was concentrating, and Hannah stood in the doorway and watched him.</w:t>
       </w:r>
     </w:p>
     <w:p>
@@ -37051,7 +36929,7 @@
         <w:pStyle w:val="BodyText"/>
       </w:pPr>
       <w:r>
-        <w:t xml:space="preserve">He hung up and swivelled round in his chair and looked at her, and she saw that he was trying not to smile.</w:t>
+        <w:t xml:space="preserve">He hung up and swiveled around in his chair and looked at her, and she saw that he was trying not to smile.</w:t>
       </w:r>
     </w:p>
     <w:p>
@@ -37125,16 +37003,16 @@
         <w:t xml:space="preserve"> </w:t>
       </w:r>
       <w:r>
-        <w:t xml:space="preserve">Eli got up and came round the desk and took both her hands, very seriously, as if he were about to propose a business merger.</w:t>
-      </w:r>
-      <w:r>
-        <w:t xml:space="preserve"> </w:t>
-      </w:r>
-      <w:r>
-        <w:t xml:space="preserve">“</w:t>
-      </w:r>
-      <w:r>
-        <w:t xml:space="preserve">Mr. Dorsey says it’s the only way to make the trust properly symbolic. Two trustees. Two names. One sign. And the dog gets a name on the deed too, which he says is an honour in the county and he’s not going to argue about it.</w:t>
+        <w:t xml:space="preserve">Eli got up and came around the desk and took both her hands, very seriously, as if he were about to propose a business merger.</w:t>
+      </w:r>
+      <w:r>
+        <w:t xml:space="preserve"> </w:t>
+      </w:r>
+      <w:r>
+        <w:t xml:space="preserve">“</w:t>
+      </w:r>
+      <w:r>
+        <w:t xml:space="preserve">Mr. Dorsey says it’s the only way to make the trust properly symbolic. Two trustees. Two names. One sign. And the dog gets a name on the deed too, which he says is an honors in the county and he’s not going to argue about it.</w:t>
       </w:r>
       <w:r>
         <w:t xml:space="preserve">”</w:t>
@@ -37429,7 +37307,7 @@
         <w:pStyle w:val="BodyText"/>
       </w:pPr>
       <w:r>
-        <w:t xml:space="preserve">She put her arms round his neck and kissed him, hard and fast, in the doorway of the back office with the window full of gold leaf and the sound of Reid’s brushes tapping lightly against the glass outside.</w:t>
+        <w:t xml:space="preserve">She put her arms around his neck and kissed him, hard and fast, in the doorway of the back office with the window full of gold leaf and the sound of Reid’s brushes tapping lightly against the glass outside.</w:t>
       </w:r>
     </w:p>
     <w:p>
@@ -37662,7 +37540,7 @@
         <w:pStyle w:val="BodyText"/>
       </w:pPr>
       <w:r>
-        <w:t xml:space="preserve">Mrs. Ortiz came out of the diner with her arms full of cinnamon rolls and stood on the pavement looking up at it for a long time, with her glasses pushed up on her forehead and her mouth working silently.</w:t>
+        <w:t xml:space="preserve">Mrs. Ortiz came out of the diner with her arms full of cinnamon rolls and stood on the sidewalk looking up at it for a long time, with her glasses pushed up on her forehead and her mouth working silently.</w:t>
       </w:r>
     </w:p>
     <w:p>
@@ -37828,7 +37706,7 @@
         <w:pStyle w:val="BodyText"/>
       </w:pPr>
       <w:r>
-        <w:t xml:space="preserve">They had come with flour on their sleeves and sceptical looks on their faces. There were schoolchildren from the primary across the river, herded by a harassed teacher who had promised them cinnamon rolls if they behaved. There were two retired nurses who wanted to learn how to make rye. There was a man from the county planning office who said he had come to check the fire exits and stayed to knead a loaf of soda bread so badly that Mrs. Ortiz took it away from him and fed it to Biscuit. There was the vicar, who had brought his own apron, and Tom Kowalski, who had brought his sourdough starter in a jar and insisted on introducing it to everybody.</w:t>
+        <w:t xml:space="preserve">They had come with flour on their sleeves and skeptical looks on their faces. There were schoolchildren from the elementary school across the river, herded by a harassed teacher who had promised them cinnamon rolls if they behaved. There were two retired nurses who wanted to learn how to make rye. There was a man from the county planning office who said he had come to check the fire exits and stayed to knead a loaf of soda bread so badly that Mrs. Ortiz took it away from him and fed it to Biscuit. There was the vicar, who had brought his own apron, and Tom Kowalski, who had brought his sourdough starter in a jar and insisted on introducing it to everybody.</w:t>
       </w:r>
     </w:p>
     <w:p>
@@ -37857,7 +37735,7 @@
         <w:t xml:space="preserve">“</w:t>
       </w:r>
       <w:r>
-        <w:t xml:space="preserve">She’s nine months old and she’s very temperamental. Be gentle with her.</w:t>
+        <w:t xml:space="preserve">She’s two months old and she’s very temperamental. Be gentle with her.</w:t>
       </w:r>
       <w:r>
         <w:t xml:space="preserve">”</w:t>
@@ -37889,7 +37767,7 @@
         <w:t xml:space="preserve">“</w:t>
       </w:r>
       <w:r>
-        <w:t xml:space="preserve">Mabel the second died in the spring. We had a funeral. There was cake.</w:t>
+        <w:t xml:space="preserve">Mabel the second died in February. We had a funeral. There was cake.</w:t>
       </w:r>
       <w:r>
         <w:t xml:space="preserve">”</w:t>
@@ -38042,7 +37920,7 @@
         <w:pStyle w:val="BodyText"/>
       </w:pPr>
       <w:r>
-        <w:t xml:space="preserve">At noon, Hannah took the old rolling pin from its box on the shelf. It was cast iron, scuffed and worn, its handle polished pale by three generations of hands. The children gathered round as she rolled out a sheet of dough, slowly and carefully, the way Gran had taught her.</w:t>
+        <w:t xml:space="preserve">At noon, Hannah took the old rolling pin from its box on the shelf. It was cast iron, scuffed and worn, its handle polished pale by three generations of hands. The children gathered around as she rolled out a sheet of dough, slowly and carefully, the way Gran had taught her.</w:t>
       </w:r>
     </w:p>
     <w:p>
@@ -38274,7 +38152,7 @@
           <w:iCs/>
           <w:i/>
         </w:rPr>
-        <w:t xml:space="preserve">Carver &amp; Son — Est. 1948</w:t>
+        <w:t xml:space="preserve">Carver &amp; Son — Est. 1978</w:t>
       </w:r>
       <w:r>
         <w:t xml:space="preserve">. Inside, nested in a bed of straw, was a claw hammer with a worn wooden handle and a head that had been polished bright by years of use.</w:t>
@@ -38754,7 +38632,7 @@
         <w:pStyle w:val="BodyText"/>
       </w:pPr>
       <w:r>
-        <w:t xml:space="preserve">He sat down beside her on the crate, and put his arm round her shoulders, and for a while they simply watched the lamp flicker and listened to the dog breathe.</w:t>
+        <w:t xml:space="preserve">He sat down beside her on the crate, and put his arm around her shoulders, and for a while they simply watched the lamp flicker and listened to the dog breathe.</w:t>
       </w:r>
     </w:p>
     <w:p>
@@ -39232,7 +39110,7 @@
         <w:pStyle w:val="BodyText"/>
       </w:pPr>
       <w:r>
-        <w:t xml:space="preserve">The line for the Winter Harvest opened at eight, and by nine it stretched past the church and round the corner onto Mill Lane. The Bread Club members had come first, of course, with their reusable bags and their monthly newsletters and their hopeful, slightly anxious faces, eager to see whether the cinnamon roll shaped like a dog had survived its move to the new season. Mrs. Ortiz had stationed herself at the front of the queue with a clipboard and a fierce expression, and was handing out tickets to anyone who looked like they might try to cut in line.</w:t>
+        <w:t xml:space="preserve">The line for the Winter Harvest opened at eight, and by nine it stretched past the church and around the corner onto Mill Lane. The Bread Club members had come first, of course, with their reusable bags and their monthly newsletters and their hopeful, slightly anxious faces, eager to see whether the cinnamon roll shaped like a dog had survived its move to the new season. Mrs. Ortiz had stationed herself at the front of the line with a clipboard and a fierce expression, and was handing out tickets to anyone who looked like they might try to cut in line.</w:t>
       </w:r>
     </w:p>
     <w:p>
@@ -39280,7 +39158,7 @@
         <w:pStyle w:val="BodyText"/>
       </w:pPr>
       <w:r>
-        <w:t xml:space="preserve">Jess arrived at ten, with a car full of cousins, a box of Christmas biscuits from her own kitchen, and a banner that read, in glittering purple letters,</w:t>
+        <w:t xml:space="preserve">Jess arrived at ten, with a car full of cousins, a box of Christmas cookies from her own kitchen, and a banner that read, in glittering purple letters,</w:t>
       </w:r>
       <w:r>
         <w:t xml:space="preserve"> </w:t>
@@ -39402,7 +39280,7 @@
         <w:pStyle w:val="BodyText"/>
       </w:pPr>
       <w:r>
-        <w:t xml:space="preserve">Eli came in, stamping the snow from his boots, with a red wool scarf wound twice round his neck and two cups of coffee in his hands.</w:t>
+        <w:t xml:space="preserve">Eli came in, stamping the snow from his boots, with a red wool scarf wound twice around his neck and two cups of coffee in his hands.</w:t>
       </w:r>
     </w:p>
     <w:p>
@@ -39490,7 +39368,7 @@
         <w:pStyle w:val="BodyText"/>
       </w:pPr>
       <w:r>
-        <w:t xml:space="preserve">He sat down on the stool beside her and put his arm round her shoulders, and she leaned into him, tired and warm and happier than she had ever been in her life. Biscuit, who had been lying under the table with his head on Eli’s boot, lifted his head, looked at them both, and sighed the long, deep, contented sigh of a dog who had finally been proved right about everything.</w:t>
+        <w:t xml:space="preserve">He sat down on the stool beside her and put his arm around her shoulders, and she leaned into him, tired and warm and happier than she had ever been in her life. Biscuit, who had been lying under the table with his head on Eli’s boot, lifted his head, looked at them both, and sighed the long, deep, contented sigh of a dog who had finally been proved right about everything.</w:t>
       </w:r>
     </w:p>
     <w:p>
@@ -39530,7 +39408,7 @@
         <w:pStyle w:val="BodyText"/>
       </w:pPr>
       <w:r>
-        <w:t xml:space="preserve">She looked up. He was holding an envelope, cream-coloured and dusty, with a postmark she did not recognise and an address written across the front in a tight, careful hand that she knew, at once, belonged to her grandmother.</w:t>
+        <w:t xml:space="preserve">She looked up. He was holding an envelope, cream-color and dusty, with a postmark she did not recognize and an address written across the front in a tight, careful hand that she knew, at once, belonged to her grandmother.</w:t>
       </w:r>
     </w:p>
     <w:p>
@@ -39667,7 +39545,7 @@
         <w:t xml:space="preserve"> </w:t>
       </w:r>
       <w:r>
-        <w:t xml:space="preserve">it began, in the same looping, careful hand that had filled the ledgers and the recipe cards and the label on the rolling pin.</w:t>
+        <w:t xml:space="preserve">it began, in the same looping, careful hand that had filled the ledgers and the recipe cards.</w:t>
       </w:r>
       <w:r>
         <w:t xml:space="preserve"> </w:t>
@@ -40034,7 +39912,7 @@
         <w:pStyle w:val="BodyText"/>
       </w:pPr>
       <w:r>
-        <w:t xml:space="preserve">She thought of Eli, kneeling on the floor of a hardware store with a safe open beside him, and the letter that had taken him thirty years to read.</w:t>
+        <w:t xml:space="preserve">She thought of Eli, kneeling on the floor of a hardware store with a safe open beside him, and the letter that had taken him years to read.</w:t>
       </w:r>
     </w:p>
     <w:p>

</xml_diff>

<commit_message>
Bakery on Cutter Street: fix remaining read-through issues
- Chapter Eleven title changed to "Sold Out by Four".
- Chapter Thirty-Six: postcard no longer repeats the wrist line.
- Chapter Thirty-Eight: proposal reworded (partner, not trustee; January).
- Rebuilt manuscript, EPUB (EPUBCheck 0 errors, 0 warnings) and DOCX.

Co-Authored-By: Claude Haiku 5.5 <noreply@anthropic.com>
Claude-Session: https://claude.ai/code/session_01MZeVJcyf7XvKRRCE6AUkLk
</commit_message>
<xml_diff>
--- a/Ready to publish/the-bakery-on-cutter-street-book-1/the-bakery-on-cutter-street.docx
+++ b/Ready to publish/the-bakery-on-cutter-street-book-1/the-bakery-on-cutter-street.docx
@@ -9595,13 +9595,13 @@
       </w:r>
     </w:p>
     <w:bookmarkEnd w:id="29"/>
-    <w:bookmarkStart w:id="30" w:name="chapter-eleven-sold-out-by-noon"/>
+    <w:bookmarkStart w:id="30" w:name="chapter-eleven-sold-out-by-four"/>
     <w:p>
       <w:pPr>
         <w:pStyle w:val="Heading1"/>
       </w:pPr>
       <w:r>
-        <w:t xml:space="preserve">Chapter Eleven: Sold Out by Noon</w:t>
+        <w:t xml:space="preserve">Chapter Eleven: Sold Out by Four</w:t>
       </w:r>
     </w:p>
     <w:p>
@@ -35593,7 +35593,7 @@
           <w:iCs/>
           <w:i/>
         </w:rPr>
-        <w:t xml:space="preserve">Eli. Sorry about the wrist. I was not brave enough to say it properly then. I am trying now. I have been sober for six years and I am living in a small apartment near the water with a cat named Bruce who hates me. I know you don’t want to hear from me. I know I don’t deserve to be heard. But I wanted you to know that I think about the roof, and the tar, and your father carrying you home over his shoulder. I think about it every day. — Mom.</w:t>
+        <w:t xml:space="preserve">Eli. I was sorry then, and I was not brave enough to say it properly. I am trying now. I have been sober for six years and I am living in a small apartment near the water with a cat named Bruce who hates me. I know you don’t want to hear from me. I know I don’t deserve to be heard. But I wanted you to know that I think about the roof, and the tar, and your father carrying you home over his shoulder. I think about it every day. — Mom.</w:t>
       </w:r>
     </w:p>
     <w:p>
@@ -38364,7 +38364,7 @@
         <w:t xml:space="preserve">“</w:t>
       </w:r>
       <w:r>
-        <w:t xml:space="preserve">I’m not going to propose again. I’m going to ask you something I should have asked in the spring, when we had the sign up and the dog watching, and I was too scared to say it properly.</w:t>
+        <w:t xml:space="preserve">I’m not going to propose again. I’m going to ask you something I should have asked in January, when we had the sign up and the dog watching, and I was too scared to say it properly.</w:t>
       </w:r>
       <w:r>
         <w:t xml:space="preserve">”</w:t>
@@ -38382,7 +38382,7 @@
         <w:t xml:space="preserve">“</w:t>
       </w:r>
       <w:r>
-        <w:t xml:space="preserve">I’m asking you to be my trustee. Not because of the building, though I’ll never stop being grateful for it. I’m asking because you’re the only person I’ve ever met who looked at the worst thing my father ever did and said</w:t>
+        <w:t xml:space="preserve">I’m asking you to be my partner, in the building and out of it. Not because of the building, though I’ll never stop being grateful for it. I’m asking because you’re the only person I’ve ever met who looked at the worst thing my father ever did and said</w:t>
       </w:r>
       <w:r>
         <w:t xml:space="preserve"> </w:t>
@@ -38515,7 +38515,7 @@
         <w:t xml:space="preserve">“</w:t>
       </w:r>
       <w:r>
-        <w:t xml:space="preserve">I’ll be your trustee. I’ll be your wife, too, if you’re going to be this insistent about it. And if you ever burn the toast again, I’m going to make you eat the crust with the hammer.</w:t>
+        <w:t xml:space="preserve">I’ll be your partner. I’ll be your wife, too, if you’re going to be this insistent about it. And if you ever burn the toast again, I’m going to make you eat the crust with the hammer.</w:t>
       </w:r>
       <w:r>
         <w:t xml:space="preserve">”</w:t>

</xml_diff>